<commit_message>
Docx was causing Index errors - because there was a space between the "include_docx_template("docassemble.AKA2JBranding:" and the content.docx, right after the colon!!! Check first next time!!
</commit_message>
<xml_diff>
--- a/docassemble/ChangingOrEnforcingYourChildSupportOrder/data/templates/changing_child_support_action_plan.docx
+++ b/docassemble/ChangingOrEnforcingYourChildSupportOrder/data/templates/changing_child_support_action_plan.docx
@@ -32,8 +32,7 @@
           </w:tcPr>
           <w:p>
             <w:pPr>
-              <w:pStyle w:val="Heading1"/>
-              <w:outlineLvl w:val="0"/>
+              <w:pStyle w:val="Title"/>
             </w:pPr>
             <w:r>
               <w:rPr>
@@ -98,12 +97,6 @@
             <w:r>
               <w:t xml:space="preserve"> Your Child Support Order</w:t>
             </w:r>
-          </w:p>
-          <w:p>
-            <w:pPr>
-              <w:pStyle w:val="Heading1"/>
-              <w:outlineLvl w:val="0"/>
-            </w:pPr>
             <w:r>
               <w:t xml:space="preserve"> in Alaska</w:t>
             </w:r>
@@ -807,39 +800,10 @@
               <w:t xml:space="preserve">Your Action Plan in </w:t>
             </w:r>
             <w:r>
-              <w:rPr>
-                <w:rFonts w:eastAsia="Arial"/>
-              </w:rPr>
-              <w:fldChar w:fldCharType="begin"/>
-            </w:r>
-            <w:r>
-              <w:instrText xml:space="preserve"> REF  LastStep </w:instrText>
-            </w:r>
-            <w:r>
-              <w:instrText xml:space="preserve"> \* MERGEFORMAT </w:instrText>
-            </w:r>
-            <w:r>
-              <w:rPr>
-                <w:rFonts w:eastAsia="Arial"/>
-              </w:rPr>
-              <w:fldChar w:fldCharType="separate"/>
-            </w:r>
-            <w:r>
-              <w:rPr>
-                <w:rStyle w:val="NumChar"/>
-                <w:noProof/>
-              </w:rPr>
-              <w:t>26</w:t>
-            </w:r>
-            <w:r>
-              <w:rPr>
-                <w:rStyle w:val="NumChar"/>
-                <w:noProof/>
-              </w:rPr>
-              <w:fldChar w:fldCharType="end"/>
-            </w:r>
-            <w:r>
-              <w:t xml:space="preserve"> Steps</w:t>
+              <w:t xml:space="preserve">{{ step_list | length }} </w:t>
+            </w:r>
+            <w:r>
+              <w:t>Steps</w:t>
             </w:r>
           </w:p>
         </w:tc>
@@ -913,52 +877,42 @@
               </w:rPr>
               <w:t>(</w:t>
             </w:r>
-            <w:proofErr w:type="spellStart"/>
             <w:r>
               <w:rPr>
                 <w:color w:val="00B050"/>
               </w:rPr>
-              <w:t>unknown_final_date.true_values</w:t>
-            </w:r>
-            <w:proofErr w:type="spellEnd"/>
+              <w:t>unknown_final_date.true_values()</w:t>
+            </w:r>
+            <w:r>
+              <w:rPr>
+                <w:color w:val="FF0000"/>
+              </w:rPr>
+              <w:t>)</w:t>
+            </w:r>
+            <w:r>
+              <w:rPr>
+                <w:color w:val="FF0000"/>
+              </w:rPr>
+              <w:t>|</w:t>
+            </w:r>
             <w:r>
               <w:rPr>
                 <w:color w:val="00B050"/>
               </w:rPr>
-              <w:t>()</w:t>
+              <w:t>list</w:t>
             </w:r>
             <w:r>
               <w:rPr>
                 <w:color w:val="FF0000"/>
               </w:rPr>
-              <w:t>)</w:t>
-            </w:r>
-            <w:r>
-              <w:rPr>
-                <w:color w:val="FF0000"/>
-              </w:rPr>
               <w:t>|</w:t>
             </w:r>
-            <w:proofErr w:type="spellStart"/>
             <w:r>
               <w:rPr>
                 <w:color w:val="00B050"/>
               </w:rPr>
-              <w:t>list</w:t>
-            </w:r>
-            <w:r>
-              <w:rPr>
-                <w:color w:val="FF0000"/>
-              </w:rPr>
-              <w:t>|</w:t>
-            </w:r>
-            <w:r>
-              <w:rPr>
-                <w:color w:val="00B050"/>
-              </w:rPr>
               <w:t>length</w:t>
             </w:r>
-            <w:proofErr w:type="spellEnd"/>
             <w:r>
               <w:rPr>
                 <w:color w:val="00B050"/>
@@ -996,7 +950,6 @@
               </w:rPr>
               <w:t xml:space="preserve"> </w:t>
             </w:r>
-            <w:proofErr w:type="spellStart"/>
             <w:r>
               <w:rPr>
                 <w:color w:val="00B050"/>
@@ -1015,7 +968,6 @@
               </w:rPr>
               <w:t>resources</w:t>
             </w:r>
-            <w:proofErr w:type="spellEnd"/>
             <w:r>
               <w:rPr>
                 <w:color w:val="00B050"/>
@@ -1029,19 +981,11 @@
               <w:br/>
               <w:t xml:space="preserve">or </w:t>
             </w:r>
-            <w:proofErr w:type="spellStart"/>
             <w:r>
               <w:rPr>
                 <w:color w:val="00B050"/>
               </w:rPr>
-              <w:t>unknown_interim_date</w:t>
-            </w:r>
-            <w:proofErr w:type="spellEnd"/>
-            <w:r>
-              <w:rPr>
-                <w:color w:val="00B050"/>
-              </w:rPr>
-              <w:t xml:space="preserve"> == 'both'</w:t>
+              <w:t>unknown_interim_date == 'both'</w:t>
             </w:r>
             <w:bookmarkStart w:id="1" w:name="_Hlk143062850"/>
             <w:r>
@@ -1152,11 +1096,9 @@
             <w:pPr>
               <w:pStyle w:val="Body"/>
             </w:pPr>
-            <w:proofErr w:type="spellStart"/>
             <w:r>
               <w:t>pick_a_step_step</w:t>
             </w:r>
-            <w:proofErr w:type="spellEnd"/>
             <w:r>
               <w:t xml:space="preserve"> from </w:t>
             </w:r>
@@ -1196,16 +1138,11 @@
             <w:r>
               <w:t xml:space="preserve">{ </w:t>
             </w:r>
-            <w:proofErr w:type="spellStart"/>
             <w:r>
               <w:t>pick_a_step_step</w:t>
             </w:r>
             <w:r>
-              <w:t>.subject</w:t>
-            </w:r>
-            <w:proofErr w:type="spellEnd"/>
-            <w:r>
-              <w:t xml:space="preserve"> </w:t>
+              <w:t xml:space="preserve">.subject </w:t>
             </w:r>
             <w:r>
               <w:t>}</w:t>
@@ -1232,7 +1169,7 @@
               <w:t>{{p (include_docx_template("docassemble.AKA2JBranding:</w:t>
             </w:r>
             <w:r>
-              <w:t xml:space="preserve"> pick_a_step_</w:t>
+              <w:t>pick_a_step_</w:t>
             </w:r>
             <w:r>
               <w:t>content.docx")) }}</w:t>
@@ -1261,6 +1198,7 @@
               <w:rPr>
                 <w:color w:val="FFC000"/>
               </w:rPr>
+              <w:lastRenderedPageBreak/>
               <w:t>{%tr endif %}</w:t>
             </w:r>
           </w:p>
@@ -1278,11 +1216,9 @@
             <w:pPr>
               <w:pStyle w:val="Body"/>
             </w:pPr>
-            <w:proofErr w:type="spellStart"/>
             <w:r>
               <w:t>ask_court_step</w:t>
             </w:r>
-            <w:proofErr w:type="spellEnd"/>
             <w:r>
               <w:br/>
             </w:r>
@@ -1313,7 +1249,6 @@
               <w:rPr>
                 <w:color w:val="FFC000"/>
               </w:rPr>
-              <w:lastRenderedPageBreak/>
               <w:t>{%tr if why_change == 'schedule'</w:t>
             </w:r>
             <w:r>
@@ -1362,21 +1297,13 @@
               <w:t>{</w:t>
             </w:r>
             <w:r>
-              <w:t xml:space="preserve">{ </w:t>
-            </w:r>
-            <w:proofErr w:type="spellStart"/>
-            <w:r>
-              <w:t>ask_court</w:t>
+              <w:t>{ ask_court</w:t>
             </w:r>
             <w:r>
               <w:t>_step</w:t>
             </w:r>
             <w:r>
-              <w:t>.subject</w:t>
-            </w:r>
-            <w:proofErr w:type="spellEnd"/>
-            <w:r>
-              <w:t xml:space="preserve"> </w:t>
+              <w:t xml:space="preserve">.subject </w:t>
             </w:r>
             <w:r>
               <w:t>}</w:t>
@@ -1513,17 +1440,8 @@
                   <w:rStyle w:val="Hyperlink"/>
                   <w:spacing w:val="0"/>
                 </w:rPr>
-                <w:t>.AKCourts.gov/start/</w:t>
-              </w:r>
-              <w:proofErr w:type="spellStart"/>
-              <w:r>
-                <w:rPr>
-                  <w:rStyle w:val="Hyperlink"/>
-                  <w:spacing w:val="0"/>
-                </w:rPr>
-                <w:t>ChangingChildCustody</w:t>
-              </w:r>
-              <w:proofErr w:type="spellEnd"/>
+                <w:t>.AKCourts.gov/start/ChangingChildCustody</w:t>
+              </w:r>
             </w:hyperlink>
           </w:p>
           <w:p>
@@ -1552,17 +1470,8 @@
                   <w:rStyle w:val="Hyperlink"/>
                   <w:spacing w:val="0"/>
                 </w:rPr>
-                <w:t>ak-courts.info/</w:t>
-              </w:r>
-              <w:proofErr w:type="spellStart"/>
-              <w:r>
-                <w:rPr>
-                  <w:rStyle w:val="Hyperlink"/>
-                  <w:spacing w:val="0"/>
-                </w:rPr>
-                <w:t>mtm</w:t>
-              </w:r>
-              <w:proofErr w:type="spellEnd"/>
+                <w:t>ak-courts.info/mtm</w:t>
+              </w:r>
             </w:hyperlink>
           </w:p>
         </w:tc>
@@ -1628,16 +1537,11 @@
             <w:r>
               <w:t xml:space="preserve">{%tr if </w:t>
             </w:r>
-            <w:proofErr w:type="spellStart"/>
             <w:r>
               <w:t>find</w:t>
             </w:r>
             <w:r>
-              <w:t>_who_ordered</w:t>
-            </w:r>
-            <w:proofErr w:type="spellEnd"/>
-            <w:r>
-              <w:t xml:space="preserve"> == 'unknown' </w:t>
+              <w:t xml:space="preserve">_who_ordered == 'unknown' </w:t>
             </w:r>
             <w:r>
               <w:t>%}</w:t>
@@ -1657,11 +1561,9 @@
             <w:pPr>
               <w:pStyle w:val="Body"/>
             </w:pPr>
-            <w:proofErr w:type="spellStart"/>
             <w:r>
               <w:t>find_out_step</w:t>
             </w:r>
-            <w:proofErr w:type="spellEnd"/>
             <w:r>
               <w:br/>
             </w:r>
@@ -1702,21 +1604,13 @@
               <w:t>{</w:t>
             </w:r>
             <w:r>
-              <w:t xml:space="preserve">{ </w:t>
-            </w:r>
-            <w:proofErr w:type="spellStart"/>
-            <w:r>
-              <w:t>find_out</w:t>
+              <w:t>{ find_out</w:t>
             </w:r>
             <w:r>
               <w:t>_step</w:t>
             </w:r>
             <w:r>
-              <w:t>.subject</w:t>
-            </w:r>
-            <w:proofErr w:type="spellEnd"/>
-            <w:r>
-              <w:t xml:space="preserve"> }</w:t>
+              <w:t>.subject }</w:t>
             </w:r>
             <w:r>
               <w:t>}</w:t>
@@ -1811,6 +1705,9 @@
             </w:r>
             <w:r>
               <w:br/>
+            </w:r>
+            <w:r>
+              <w:lastRenderedPageBreak/>
               <w:t xml:space="preserve">Monday – Thursday, </w:t>
             </w:r>
             <w:r>
@@ -1879,7 +1776,6 @@
               <w:pStyle w:val="ListParagraph"/>
             </w:pPr>
             <w:r>
-              <w:lastRenderedPageBreak/>
               <w:t xml:space="preserve">Email: </w:t>
             </w:r>
             <w:hyperlink r:id="rId16" w:history="1">
@@ -2242,6 +2138,7 @@
               <w:pStyle w:val="ListParagraph"/>
             </w:pPr>
             <w:r>
+              <w:lastRenderedPageBreak/>
               <w:t xml:space="preserve">Until you tell </w:t>
             </w:r>
             <w:r>
@@ -2317,7 +2214,6 @@
               <w:rPr>
                 <w:color w:val="FF0000"/>
               </w:rPr>
-              <w:lastRenderedPageBreak/>
               <w:t>{%p if user_need == 'change AK order' %}</w:t>
             </w:r>
           </w:p>
@@ -2490,17 +2386,8 @@
                   <w:rStyle w:val="Hyperlink"/>
                   <w:spacing w:val="0"/>
                 </w:rPr>
-                <w:t>ak-courts.info/</w:t>
-              </w:r>
-              <w:proofErr w:type="spellStart"/>
-              <w:r>
-                <w:rPr>
-                  <w:rStyle w:val="Hyperlink"/>
-                  <w:spacing w:val="0"/>
-                </w:rPr>
-                <w:t>dir</w:t>
-              </w:r>
-              <w:proofErr w:type="spellEnd"/>
+                <w:t>ak-courts.info/dir</w:t>
+              </w:r>
             </w:hyperlink>
           </w:p>
           <w:p>
@@ -2529,52 +2416,34 @@
                   <w:rStyle w:val="Hyperlink"/>
                   <w:spacing w:val="0"/>
                 </w:rPr>
-                <w:t>ak-courts.info/</w:t>
-              </w:r>
-              <w:proofErr w:type="spellStart"/>
+                <w:t>ak-courts.info/courtview</w:t>
+              </w:r>
+            </w:hyperlink>
+          </w:p>
+          <w:p>
+            <w:pPr>
+              <w:pStyle w:val="Body"/>
+            </w:pPr>
+            <w:hyperlink r:id="rId40" w:history="1">
               <w:r>
                 <w:rPr>
                   <w:rStyle w:val="Hyperlink"/>
                   <w:spacing w:val="0"/>
                 </w:rPr>
-                <w:t>courtview</w:t>
-              </w:r>
-              <w:proofErr w:type="spellEnd"/>
+                <w:t>Court Guide Action Plan</w:t>
+              </w:r>
             </w:hyperlink>
-          </w:p>
-          <w:p>
-            <w:pPr>
-              <w:pStyle w:val="Body"/>
-            </w:pPr>
-            <w:hyperlink r:id="rId40" w:history="1">
+            <w:r>
+              <w:br/>
+            </w:r>
+            <w:hyperlink r:id="rId41" w:history="1">
               <w:r>
                 <w:rPr>
                   <w:rStyle w:val="Hyperlink"/>
                   <w:spacing w:val="0"/>
                 </w:rPr>
-                <w:t>Court Guide Action Plan</w:t>
-              </w:r>
-            </w:hyperlink>
-            <w:r>
-              <w:br/>
-            </w:r>
-            <w:hyperlink r:id="rId41" w:history="1">
-              <w:r>
-                <w:rPr>
-                  <w:rStyle w:val="Hyperlink"/>
-                  <w:spacing w:val="0"/>
-                </w:rPr>
-                <w:t>courtguide.akcourts.gov/start/</w:t>
-              </w:r>
-              <w:proofErr w:type="spellStart"/>
-              <w:r>
-                <w:rPr>
-                  <w:rStyle w:val="Hyperlink"/>
-                  <w:spacing w:val="0"/>
-                </w:rPr>
-                <w:t>ChangingEnforcingChildSupport</w:t>
-              </w:r>
-              <w:proofErr w:type="spellEnd"/>
+                <w:t>courtguide.akcourts.gov/start/ChangingEnforcingChildSupport</w:t>
+              </w:r>
             </w:hyperlink>
           </w:p>
           <w:p>
@@ -2667,17 +2536,8 @@
                   <w:rStyle w:val="Hyperlink"/>
                   <w:spacing w:val="0"/>
                 </w:rPr>
-                <w:t>ak-courts.info/</w:t>
-              </w:r>
-              <w:proofErr w:type="spellStart"/>
-              <w:r>
-                <w:rPr>
-                  <w:rStyle w:val="Hyperlink"/>
-                  <w:spacing w:val="0"/>
-                </w:rPr>
-                <w:t>mtm</w:t>
-              </w:r>
-              <w:proofErr w:type="spellEnd"/>
+                <w:t>ak-courts.info/mtm</w:t>
+              </w:r>
             </w:hyperlink>
           </w:p>
           <w:p>
@@ -2688,6 +2548,7 @@
               <w:rPr>
                 <w:color w:val="FF0000"/>
               </w:rPr>
+              <w:lastRenderedPageBreak/>
               <w:t>{%p endif %}</w:t>
             </w:r>
           </w:p>
@@ -2779,35 +2640,20 @@
             <w:r>
               <w:t>(</w:t>
             </w:r>
-            <w:proofErr w:type="spellStart"/>
-            <w:r>
-              <w:t>who_ordered</w:t>
-            </w:r>
-            <w:proofErr w:type="spellEnd"/>
-            <w:r>
-              <w:t xml:space="preserve"> == </w:t>
+            <w:r>
+              <w:t xml:space="preserve">who_ordered == </w:t>
             </w:r>
             <w:r>
               <w:t>'</w:t>
             </w:r>
-            <w:proofErr w:type="spellStart"/>
             <w:r>
               <w:t>cssd</w:t>
             </w:r>
-            <w:proofErr w:type="spellEnd"/>
             <w:r>
               <w:t>' or</w:t>
             </w:r>
             <w:r>
-              <w:t xml:space="preserve"> (</w:t>
-            </w:r>
-            <w:proofErr w:type="spellStart"/>
-            <w:r>
-              <w:t>who_ordered</w:t>
-            </w:r>
-            <w:proofErr w:type="spellEnd"/>
-            <w:r>
-              <w:t xml:space="preserve"> == </w:t>
+              <w:t xml:space="preserve"> (who_ordered == </w:t>
             </w:r>
             <w:r>
               <w:t>'</w:t>
@@ -2819,25 +2665,14 @@
               <w:t>'</w:t>
             </w:r>
             <w:r>
-              <w:t xml:space="preserve"> and </w:t>
-            </w:r>
-            <w:proofErr w:type="spellStart"/>
-            <w:r>
-              <w:lastRenderedPageBreak/>
-              <w:t>find_who_ordered</w:t>
-            </w:r>
-            <w:proofErr w:type="spellEnd"/>
-            <w:r>
-              <w:t xml:space="preserve"> == </w:t>
+              <w:t xml:space="preserve"> and find_who_ordered == </w:t>
             </w:r>
             <w:r>
               <w:t>'</w:t>
             </w:r>
-            <w:proofErr w:type="spellStart"/>
             <w:r>
               <w:t>cssd</w:t>
             </w:r>
-            <w:proofErr w:type="spellEnd"/>
             <w:r>
               <w:t>'</w:t>
             </w:r>
@@ -2862,12 +2697,9 @@
             <w:pPr>
               <w:pStyle w:val="Body"/>
             </w:pPr>
-            <w:proofErr w:type="spellStart"/>
-            <w:r>
-              <w:lastRenderedPageBreak/>
+            <w:r>
               <w:t>ask_cssd_step</w:t>
             </w:r>
-            <w:proofErr w:type="spellEnd"/>
             <w:r>
               <w:br/>
             </w:r>
@@ -2898,16 +2730,11 @@
             <w:r>
               <w:t xml:space="preserve">{{ </w:t>
             </w:r>
-            <w:proofErr w:type="spellStart"/>
             <w:r>
               <w:t>ask_cssd_</w:t>
             </w:r>
             <w:r>
-              <w:t>step.subject</w:t>
-            </w:r>
-            <w:proofErr w:type="spellEnd"/>
-            <w:r>
-              <w:t xml:space="preserve"> }}</w:t>
+              <w:t>step.subject }}</w:t>
             </w:r>
           </w:p>
         </w:tc>
@@ -3114,6 +2941,7 @@
               <w:pStyle w:val="Body"/>
             </w:pPr>
             <w:r>
+              <w:lastRenderedPageBreak/>
               <w:t>If your parenting schedule changes, or your income or the other parent</w:t>
             </w:r>
             <w:r>
@@ -3399,22 +3227,14 @@
               <w:rPr>
                 <w:color w:val="FF0000"/>
               </w:rPr>
-              <w:t xml:space="preserve"> </w:t>
-            </w:r>
-            <w:proofErr w:type="spellStart"/>
+              <w:t xml:space="preserve"> parents_agree</w:t>
+            </w:r>
             <w:r>
               <w:rPr>
                 <w:color w:val="FF0000"/>
               </w:rPr>
-              <w:t>parents_agree</w:t>
-            </w:r>
-            <w:r>
-              <w:rPr>
-                <w:color w:val="FF0000"/>
-              </w:rPr>
               <w:t>_resources</w:t>
             </w:r>
-            <w:proofErr w:type="spellEnd"/>
             <w:r>
               <w:rPr>
                 <w:color w:val="FF0000"/>
@@ -3436,14 +3256,12 @@
             <w:pPr>
               <w:pStyle w:val="Body"/>
             </w:pPr>
-            <w:proofErr w:type="spellStart"/>
             <w:r>
               <w:t>tell_the_court</w:t>
             </w:r>
             <w:r>
               <w:t>_step</w:t>
             </w:r>
-            <w:proofErr w:type="spellEnd"/>
             <w:r>
               <w:t xml:space="preserve"> from </w:t>
             </w:r>
@@ -3478,21 +3296,13 @@
               <w:outlineLvl w:val="1"/>
             </w:pPr>
             <w:r>
-              <w:t xml:space="preserve">{{ </w:t>
-            </w:r>
-            <w:proofErr w:type="spellStart"/>
-            <w:r>
-              <w:t>tell_the_court</w:t>
+              <w:t>{{ tell_the_court</w:t>
             </w:r>
             <w:r>
               <w:t>_step</w:t>
             </w:r>
             <w:r>
-              <w:t>.subject</w:t>
-            </w:r>
-            <w:proofErr w:type="spellEnd"/>
-            <w:r>
-              <w:t xml:space="preserve"> }}</w:t>
+              <w:t>.subject }}</w:t>
             </w:r>
           </w:p>
         </w:tc>
@@ -3536,6 +3346,7 @@
               <w:rPr>
                 <w:color w:val="FF0000"/>
               </w:rPr>
+              <w:lastRenderedPageBreak/>
               <w:t>{%tr endif %}</w:t>
             </w:r>
           </w:p>
@@ -3708,7 +3519,6 @@
               <w:pStyle w:val="Body"/>
             </w:pPr>
             <w:r>
-              <w:lastRenderedPageBreak/>
               <w:t>{%tr endif %}</w:t>
             </w:r>
           </w:p>
@@ -3758,13 +3568,8 @@
             <w:r>
               <w:t xml:space="preserve">or </w:t>
             </w:r>
-            <w:proofErr w:type="spellStart"/>
-            <w:r>
-              <w:t>unknown_interim_date</w:t>
-            </w:r>
-            <w:proofErr w:type="spellEnd"/>
-            <w:r>
-              <w:t xml:space="preserve"> in (</w:t>
+            <w:r>
+              <w:t>unknown_interim_date in (</w:t>
             </w:r>
             <w:r>
               <w:t>'</w:t>
@@ -3856,21 +3661,14 @@
             <w:pPr>
               <w:pStyle w:val="Body"/>
             </w:pPr>
-            <w:proofErr w:type="spellStart"/>
             <w:r>
               <w:t>learn_reconsider_step</w:t>
             </w:r>
-            <w:proofErr w:type="spellEnd"/>
             <w:r>
               <w:t xml:space="preserve"> and </w:t>
             </w:r>
-            <w:proofErr w:type="spellStart"/>
-            <w:r>
-              <w:t>fill_reconsider_step</w:t>
-            </w:r>
-            <w:proofErr w:type="spellEnd"/>
-            <w:r>
-              <w:t xml:space="preserve"> </w:t>
+            <w:r>
+              <w:t xml:space="preserve">fill_reconsider_step </w:t>
             </w:r>
             <w:r>
               <w:t xml:space="preserve">from </w:t>
@@ -3906,15 +3704,7 @@
               <w:outlineLvl w:val="1"/>
             </w:pPr>
             <w:r>
-              <w:t xml:space="preserve">{{ </w:t>
-            </w:r>
-            <w:proofErr w:type="spellStart"/>
-            <w:r>
-              <w:t>learn_reconsider_step.subject</w:t>
-            </w:r>
-            <w:proofErr w:type="spellEnd"/>
-            <w:r>
-              <w:t xml:space="preserve"> }}</w:t>
+              <w:t>{{ learn_reconsider_step.subject }}</w:t>
             </w:r>
           </w:p>
         </w:tc>
@@ -3962,15 +3752,8 @@
               <w:outlineLvl w:val="1"/>
             </w:pPr>
             <w:r>
-              <w:t xml:space="preserve">{{ </w:t>
-            </w:r>
-            <w:proofErr w:type="spellStart"/>
-            <w:r>
-              <w:t>fill_reconsider_step.subject</w:t>
-            </w:r>
-            <w:proofErr w:type="spellEnd"/>
-            <w:r>
-              <w:t xml:space="preserve"> }}</w:t>
+              <w:lastRenderedPageBreak/>
+              <w:t>{{ fill_reconsider_step.subject }}</w:t>
             </w:r>
           </w:p>
         </w:tc>
@@ -4072,7 +3855,6 @@
               </w:rPr>
               <w:t xml:space="preserve">or </w:t>
             </w:r>
-            <w:proofErr w:type="spellStart"/>
             <w:r>
               <w:rPr>
                 <w:color w:val="00B0F0"/>
@@ -4091,7 +3873,6 @@
               </w:rPr>
               <w:t>_date</w:t>
             </w:r>
-            <w:proofErr w:type="spellEnd"/>
             <w:r>
               <w:rPr>
                 <w:color w:val="00B0F0"/>
@@ -4215,11 +3996,9 @@
             <w:pPr>
               <w:pStyle w:val="Body"/>
             </w:pPr>
-            <w:proofErr w:type="spellStart"/>
             <w:r>
               <w:t>modify_step</w:t>
             </w:r>
-            <w:proofErr w:type="spellEnd"/>
             <w:r>
               <w:t xml:space="preserve"> from </w:t>
             </w:r>
@@ -4237,11 +4016,9 @@
             <w:pPr>
               <w:pStyle w:val="Body"/>
             </w:pPr>
-            <w:proofErr w:type="spellStart"/>
             <w:r>
               <w:t>calculate_child_support_step</w:t>
             </w:r>
-            <w:proofErr w:type="spellEnd"/>
             <w:r>
               <w:t xml:space="preserve"> from </w:t>
             </w:r>
@@ -4259,11 +4036,9 @@
             <w:pPr>
               <w:pStyle w:val="Body"/>
             </w:pPr>
-            <w:proofErr w:type="spellStart"/>
             <w:r>
               <w:t>compare_child_support_step</w:t>
             </w:r>
-            <w:proofErr w:type="spellEnd"/>
             <w:r>
               <w:t xml:space="preserve"> </w:t>
             </w:r>
@@ -4284,11 +4059,9 @@
             <w:pPr>
               <w:pStyle w:val="Body"/>
             </w:pPr>
-            <w:proofErr w:type="spellStart"/>
             <w:r>
               <w:t>dont_wait_modify_child_support_step</w:t>
             </w:r>
-            <w:proofErr w:type="spellEnd"/>
             <w:r>
               <w:t xml:space="preserve"> from </w:t>
             </w:r>
@@ -4306,11 +4079,9 @@
             <w:pPr>
               <w:pStyle w:val="Body"/>
             </w:pPr>
-            <w:proofErr w:type="spellStart"/>
             <w:r>
               <w:t>fill_modify_step</w:t>
             </w:r>
-            <w:proofErr w:type="spellEnd"/>
             <w:r>
               <w:t xml:space="preserve"> from </w:t>
             </w:r>
@@ -4345,16 +4116,7 @@
               <w:outlineLvl w:val="1"/>
             </w:pPr>
             <w:r>
-              <w:lastRenderedPageBreak/>
-              <w:t xml:space="preserve">{{ </w:t>
-            </w:r>
-            <w:proofErr w:type="spellStart"/>
-            <w:r>
-              <w:t>modify_step.subject</w:t>
-            </w:r>
-            <w:proofErr w:type="spellEnd"/>
-            <w:r>
-              <w:t xml:space="preserve"> }}</w:t>
+              <w:t>{{ modify_step.subject }}</w:t>
             </w:r>
           </w:p>
         </w:tc>
@@ -4402,15 +4164,7 @@
               <w:outlineLvl w:val="1"/>
             </w:pPr>
             <w:r>
-              <w:t xml:space="preserve">{{ </w:t>
-            </w:r>
-            <w:proofErr w:type="spellStart"/>
-            <w:r>
-              <w:t>calculate_child_support_step.subject</w:t>
-            </w:r>
-            <w:proofErr w:type="spellEnd"/>
-            <w:r>
-              <w:t xml:space="preserve"> }}</w:t>
+              <w:t>{{ calculate_child_support_step.subject }}</w:t>
             </w:r>
           </w:p>
         </w:tc>
@@ -4458,15 +4212,11 @@
               <w:outlineLvl w:val="1"/>
             </w:pPr>
             <w:r>
-              <w:t xml:space="preserve">{{ </w:t>
-            </w:r>
-            <w:proofErr w:type="spellStart"/>
-            <w:r>
-              <w:t>compare_child_support_step.subject</w:t>
-            </w:r>
-            <w:proofErr w:type="spellEnd"/>
-            <w:r>
-              <w:t xml:space="preserve"> }}</w:t>
+              <w:t>{{ compare_child_support_step.</w:t>
+            </w:r>
+            <w:r>
+              <w:lastRenderedPageBreak/>
+              <w:t>subject }}</w:t>
             </w:r>
           </w:p>
         </w:tc>
@@ -4484,6 +4234,7 @@
               <w:pStyle w:val="Body"/>
             </w:pPr>
             <w:r>
+              <w:lastRenderedPageBreak/>
               <w:t>Compare your current child support to the new amount to see if there is a "material change in circumstances</w:t>
             </w:r>
             <w:r>
@@ -4498,7 +4249,11 @@
               <w:pStyle w:val="Body"/>
             </w:pPr>
             <w:r>
-              <w:t>If the new child support amount is 15% more or less than the old amount, the court presumes there is a "material change in circumstances."</w:t>
+              <w:t xml:space="preserve">If the new child support amount is 15% more or less than the old amount, the court presumes there is a "material change in </w:t>
+            </w:r>
+            <w:r>
+              <w:lastRenderedPageBreak/>
+              <w:t>circumstances."</w:t>
             </w:r>
           </w:p>
           <w:p>
@@ -4555,6 +4310,7 @@
               <w:outlineLvl w:val="1"/>
             </w:pPr>
             <w:r>
+              <w:lastRenderedPageBreak/>
               <w:t xml:space="preserve">{{ </w:t>
             </w:r>
             <w:r>
@@ -4615,15 +4371,7 @@
               <w:outlineLvl w:val="1"/>
             </w:pPr>
             <w:r>
-              <w:t xml:space="preserve">{{ </w:t>
-            </w:r>
-            <w:proofErr w:type="spellStart"/>
-            <w:r>
-              <w:t>fill_modify_step.subject</w:t>
-            </w:r>
-            <w:proofErr w:type="spellEnd"/>
-            <w:r>
-              <w:t xml:space="preserve"> }}</w:t>
+              <w:t>{{ fill_modify_step.subject }}</w:t>
             </w:r>
           </w:p>
         </w:tc>
@@ -4726,7 +4474,6 @@
               <w:pStyle w:val="Body"/>
             </w:pPr>
             <w:r>
-              <w:lastRenderedPageBreak/>
               <w:t xml:space="preserve">{%tr if </w:t>
             </w:r>
             <w:r>
@@ -4820,7 +4567,11 @@
               <w:outlineLvl w:val="1"/>
             </w:pPr>
             <w:r>
-              <w:t>{{ learn_set_aside_step.subject }}</w:t>
+              <w:t xml:space="preserve">{{ learn_set_aside_step.subject </w:t>
+            </w:r>
+            <w:r>
+              <w:lastRenderedPageBreak/>
+              <w:t>}}</w:t>
             </w:r>
           </w:p>
         </w:tc>
@@ -4838,6 +4589,7 @@
               <w:pStyle w:val="Body"/>
             </w:pPr>
             <w:r>
+              <w:lastRenderedPageBreak/>
               <w:t>{{p (include_docx_template("docassemble.AKA2JBranding:learn_set_aside</w:t>
             </w:r>
             <w:r>
@@ -5000,11 +4752,9 @@
             <w:pPr>
               <w:pStyle w:val="Body"/>
             </w:pPr>
-            <w:proofErr w:type="spellStart"/>
             <w:r>
               <w:t>foreign_step</w:t>
             </w:r>
-            <w:proofErr w:type="spellEnd"/>
             <w:r>
               <w:br/>
               <w:t>2026-08-10</w:t>
@@ -5031,15 +4781,7 @@
               <w:outlineLvl w:val="1"/>
             </w:pPr>
             <w:r>
-              <w:t xml:space="preserve">{{ </w:t>
-            </w:r>
-            <w:proofErr w:type="spellStart"/>
-            <w:r>
-              <w:t>foreign_step.subject</w:t>
-            </w:r>
-            <w:proofErr w:type="spellEnd"/>
-            <w:r>
-              <w:t xml:space="preserve"> }}</w:t>
+              <w:t>{{ foreign_step.subject }}</w:t>
             </w:r>
           </w:p>
         </w:tc>
@@ -5063,6 +4805,7 @@
           <w:p>
             <w:pPr>
               <w:pStyle w:val="Heading3"/>
+              <w:outlineLvl w:val="2"/>
             </w:pPr>
             <w:r>
               <w:t xml:space="preserve">Contact the Alaska </w:t>
@@ -5182,7 +4925,6 @@
               <w:pStyle w:val="ListPlevel2"/>
             </w:pPr>
             <w:r>
-              <w:lastRenderedPageBreak/>
               <w:t>Toll Free (In-state): 800-478-3300</w:t>
             </w:r>
           </w:p>
@@ -5266,6 +5008,7 @@
               <w:outlineLvl w:val="2"/>
             </w:pPr>
             <w:r>
+              <w:lastRenderedPageBreak/>
               <w:t>Links in this step</w:t>
             </w:r>
           </w:p>
@@ -5314,15 +5057,7 @@
               </w:r>
             </w:hyperlink>
             <w:r>
-              <w:t>acf.hhs.gov/</w:t>
-            </w:r>
-            <w:proofErr w:type="spellStart"/>
-            <w:r>
-              <w:t>css</w:t>
-            </w:r>
-            <w:proofErr w:type="spellEnd"/>
-            <w:r>
-              <w:t>/parents/find-local-child-support-office</w:t>
+              <w:t>acf.hhs.gov/css/parents/find-local-child-support-office</w:t>
             </w:r>
           </w:p>
           <w:p>
@@ -5351,17 +5086,8 @@
                   <w:rStyle w:val="Hyperlink"/>
                   <w:spacing w:val="0"/>
                 </w:rPr>
-                <w:t>ak-courts.info/</w:t>
-              </w:r>
-              <w:proofErr w:type="spellStart"/>
-              <w:r>
-                <w:rPr>
-                  <w:rStyle w:val="Hyperlink"/>
-                  <w:spacing w:val="0"/>
-                </w:rPr>
-                <w:t>findlawyer</w:t>
-              </w:r>
-              <w:proofErr w:type="spellEnd"/>
+                <w:t>ak-courts.info/findlawyer</w:t>
+              </w:r>
             </w:hyperlink>
           </w:p>
         </w:tc>
@@ -5651,252 +5377,186 @@
               <w:rPr>
                 <w:color w:val="FFC000"/>
               </w:rPr>
-              <w:t xml:space="preserve">{% if </w:t>
-            </w:r>
-            <w:proofErr w:type="spellStart"/>
+              <w:t>{% if who_</w:t>
+            </w:r>
             <w:r>
               <w:rPr>
                 <w:color w:val="FFC000"/>
               </w:rPr>
-              <w:t>who_</w:t>
+              <w:t>really_</w:t>
             </w:r>
             <w:r>
               <w:rPr>
                 <w:color w:val="FFC000"/>
               </w:rPr>
-              <w:t>really_</w:t>
+              <w:t>ordered == 'court' %}</w:t>
+            </w:r>
+            <w:r>
+              <w:rPr>
+                <w:color w:val="92D050"/>
+              </w:rPr>
+              <w:t>{% if cssd_collect == 'yes' %}</w:t>
+            </w:r>
+            <w:r>
+              <w:t xml:space="preserve">If </w:t>
+            </w:r>
+            <w:r>
+              <w:t>Child Support Enforcement Division</w:t>
+            </w:r>
+            <w:r>
+              <w:t xml:space="preserve"> (</w:t>
+            </w:r>
+            <w:r>
+              <w:t>CSED</w:t>
+            </w:r>
+            <w:r>
+              <w:t>) is collecting your child support, they can enforce your child support order</w:t>
+            </w:r>
+            <w:r>
+              <w:rPr>
+                <w:color w:val="92D050"/>
+              </w:rPr>
+              <w:t>.</w:t>
+            </w:r>
+            <w:r>
+              <w:rPr>
+                <w:color w:val="92D050"/>
+              </w:rPr>
+              <w:t xml:space="preserve">{% elif cssd_collect </w:t>
+            </w:r>
+            <w:r>
+              <w:rPr>
+                <w:color w:val="92D050"/>
+              </w:rPr>
+              <w:t>in</w:t>
+            </w:r>
+            <w:r>
+              <w:rPr>
+                <w:color w:val="92D050"/>
+              </w:rPr>
+              <w:t xml:space="preserve"> </w:t>
+            </w:r>
+            <w:r>
+              <w:rPr>
+                <w:color w:val="92D050"/>
+              </w:rPr>
+              <w:t>(</w:t>
+            </w:r>
+            <w:r>
+              <w:rPr>
+                <w:color w:val="92D050"/>
+              </w:rPr>
+              <w:t>'no'</w:t>
+            </w:r>
+            <w:r>
+              <w:rPr>
+                <w:color w:val="92D050"/>
+              </w:rPr>
+              <w:t>,</w:t>
+            </w:r>
+            <w:r>
+              <w:rPr>
+                <w:color w:val="92D050"/>
+              </w:rPr>
+              <w:t xml:space="preserve"> </w:t>
+            </w:r>
+            <w:r>
+              <w:rPr>
+                <w:color w:val="92D050"/>
+              </w:rPr>
+              <w:t>'unknown'</w:t>
+            </w:r>
+            <w:r>
+              <w:rPr>
+                <w:color w:val="92D050"/>
+              </w:rPr>
+              <w:t>)</w:t>
+            </w:r>
+            <w:r>
+              <w:rPr>
+                <w:color w:val="92D050"/>
+              </w:rPr>
+              <w:t xml:space="preserve"> %}</w:t>
+            </w:r>
+            <w:r>
+              <w:t xml:space="preserve">If you have a court order for child support and </w:t>
+            </w:r>
+            <w:r>
+              <w:t xml:space="preserve">you </w:t>
+            </w:r>
+            <w:r>
+              <w:t xml:space="preserve">want </w:t>
+            </w:r>
+            <w:r>
+              <w:t>Child Support Enforcement Division</w:t>
+            </w:r>
+            <w:r>
+              <w:t xml:space="preserve"> (</w:t>
+            </w:r>
+            <w:r>
+              <w:t>CSED</w:t>
+            </w:r>
+            <w:r>
+              <w:t xml:space="preserve">) to help you collect it, </w:t>
+            </w:r>
+            <w:hyperlink r:id="rId72" w:anchor="2" w:history="1">
+              <w:r>
+                <w:rPr>
+                  <w:rStyle w:val="Hyperlink"/>
+                  <w:spacing w:val="0"/>
+                </w:rPr>
+                <w:t xml:space="preserve">apply for </w:t>
+              </w:r>
+              <w:r>
+                <w:rPr>
+                  <w:rStyle w:val="Hyperlink"/>
+                  <w:spacing w:val="0"/>
+                </w:rPr>
+                <w:t>CSED</w:t>
+              </w:r>
+              <w:r>
+                <w:rPr>
+                  <w:rStyle w:val="Hyperlink"/>
+                  <w:spacing w:val="0"/>
+                </w:rPr>
+                <w:t xml:space="preserve"> services</w:t>
+              </w:r>
+            </w:hyperlink>
+            <w:r>
+              <w:t>.</w:t>
+            </w:r>
+            <w:r>
+              <w:rPr>
+                <w:color w:val="92D050"/>
+              </w:rPr>
+              <w:t>{% endif %}</w:t>
             </w:r>
             <w:r>
               <w:rPr>
                 <w:color w:val="FFC000"/>
               </w:rPr>
-              <w:t>ordered</w:t>
-            </w:r>
-            <w:proofErr w:type="spellEnd"/>
-            <w:r>
-              <w:rPr>
-                <w:color w:val="FFC000"/>
-              </w:rPr>
-              <w:t xml:space="preserve"> == 'court' %}</w:t>
-            </w:r>
-            <w:r>
-              <w:rPr>
-                <w:color w:val="92D050"/>
-              </w:rPr>
-              <w:t xml:space="preserve">{% if </w:t>
-            </w:r>
-            <w:proofErr w:type="spellStart"/>
-            <w:r>
-              <w:rPr>
-                <w:color w:val="92D050"/>
-              </w:rPr>
-              <w:t>cssd_collect</w:t>
-            </w:r>
-            <w:proofErr w:type="spellEnd"/>
-            <w:r>
-              <w:rPr>
-                <w:color w:val="92D050"/>
-              </w:rPr>
-              <w:t xml:space="preserve"> == 'yes' %}</w:t>
-            </w:r>
-            <w:r>
-              <w:t xml:space="preserve">If </w:t>
-            </w:r>
-            <w:r>
-              <w:t>Child Support Enforcement Division</w:t>
-            </w:r>
-            <w:r>
-              <w:t xml:space="preserve"> (</w:t>
-            </w:r>
-            <w:r>
-              <w:t>CSED</w:t>
-            </w:r>
-            <w:r>
-              <w:t>) is collecting your child support, they can enforce your child support order</w:t>
-            </w:r>
-            <w:r>
-              <w:rPr>
-                <w:color w:val="92D050"/>
-              </w:rPr>
-              <w:t>.</w:t>
-            </w:r>
-            <w:r>
-              <w:rPr>
-                <w:color w:val="92D050"/>
-              </w:rPr>
-              <w:t xml:space="preserve">{% elif </w:t>
-            </w:r>
-            <w:proofErr w:type="spellStart"/>
-            <w:r>
-              <w:rPr>
-                <w:color w:val="92D050"/>
-              </w:rPr>
-              <w:t>cssd_collect</w:t>
-            </w:r>
-            <w:proofErr w:type="spellEnd"/>
-            <w:r>
-              <w:rPr>
-                <w:color w:val="92D050"/>
-              </w:rPr>
-              <w:t xml:space="preserve"> </w:t>
-            </w:r>
-            <w:r>
-              <w:rPr>
-                <w:color w:val="92D050"/>
-              </w:rPr>
-              <w:t>in</w:t>
-            </w:r>
-            <w:r>
-              <w:rPr>
-                <w:color w:val="92D050"/>
-              </w:rPr>
-              <w:t xml:space="preserve"> </w:t>
-            </w:r>
-            <w:r>
-              <w:rPr>
-                <w:color w:val="92D050"/>
-              </w:rPr>
-              <w:t>(</w:t>
-            </w:r>
-            <w:r>
-              <w:rPr>
-                <w:color w:val="92D050"/>
-              </w:rPr>
-              <w:t>'no'</w:t>
-            </w:r>
-            <w:r>
-              <w:rPr>
-                <w:color w:val="92D050"/>
-              </w:rPr>
-              <w:t>,</w:t>
-            </w:r>
-            <w:r>
-              <w:rPr>
-                <w:color w:val="92D050"/>
-              </w:rPr>
-              <w:t xml:space="preserve"> </w:t>
-            </w:r>
-            <w:r>
-              <w:rPr>
-                <w:color w:val="92D050"/>
-              </w:rPr>
-              <w:t>'unknown'</w:t>
-            </w:r>
-            <w:r>
-              <w:rPr>
-                <w:color w:val="92D050"/>
-              </w:rPr>
-              <w:t>)</w:t>
-            </w:r>
-            <w:r>
-              <w:rPr>
-                <w:color w:val="92D050"/>
-              </w:rPr>
-              <w:t xml:space="preserve"> %}</w:t>
-            </w:r>
-            <w:r>
-              <w:t xml:space="preserve">If you have a court order for child support and </w:t>
-            </w:r>
-            <w:r>
-              <w:t xml:space="preserve">you </w:t>
-            </w:r>
-            <w:r>
-              <w:t xml:space="preserve">want </w:t>
-            </w:r>
-            <w:r>
-              <w:t>Child Support Enforcement Division</w:t>
-            </w:r>
-            <w:r>
-              <w:t xml:space="preserve"> (</w:t>
-            </w:r>
-            <w:r>
-              <w:t>CSED</w:t>
-            </w:r>
-            <w:r>
-              <w:t xml:space="preserve">) to help you collect it, </w:t>
-            </w:r>
-            <w:hyperlink r:id="rId72" w:anchor="2" w:history="1">
-              <w:r>
-                <w:rPr>
-                  <w:rStyle w:val="Hyperlink"/>
-                  <w:spacing w:val="0"/>
-                </w:rPr>
-                <w:t xml:space="preserve">apply for </w:t>
-              </w:r>
-              <w:r>
-                <w:rPr>
-                  <w:rStyle w:val="Hyperlink"/>
-                  <w:spacing w:val="0"/>
+              <w:t>{% else %}</w:t>
+            </w:r>
+          </w:p>
+          <w:p>
+            <w:pPr>
+              <w:pStyle w:val="Body"/>
+            </w:pPr>
+            <w:hyperlink r:id="rId73" w:history="1">
+              <w:r>
+                <w:rPr>
+                  <w:rStyle w:val="Hyperlink"/>
+                </w:rPr>
+                <w:t xml:space="preserve">Contact </w:t>
+              </w:r>
+              <w:r>
+                <w:rPr>
+                  <w:rStyle w:val="Hyperlink"/>
                 </w:rPr>
                 <w:t>CSED</w:t>
               </w:r>
-              <w:r>
-                <w:rPr>
-                  <w:rStyle w:val="Hyperlink"/>
-                  <w:spacing w:val="0"/>
-                </w:rPr>
-                <w:t xml:space="preserve"> services</w:t>
-              </w:r>
             </w:hyperlink>
             <w:r>
-              <w:t>.</w:t>
-            </w:r>
-            <w:r>
-              <w:rPr>
-                <w:color w:val="92D050"/>
-              </w:rPr>
-              <w:t>{% endif %}</w:t>
-            </w:r>
-            <w:r>
-              <w:rPr>
-                <w:color w:val="FFC000"/>
-              </w:rPr>
-              <w:t>{% else %}</w:t>
-            </w:r>
-          </w:p>
-          <w:p>
-            <w:pPr>
-              <w:pStyle w:val="Body"/>
-            </w:pPr>
-            <w:hyperlink r:id="rId73" w:history="1">
-              <w:r>
-                <w:rPr>
-                  <w:rStyle w:val="Hyperlink"/>
-                </w:rPr>
-                <w:t>Co</w:t>
-              </w:r>
-              <w:r>
-                <w:rPr>
-                  <w:rStyle w:val="Hyperlink"/>
-                </w:rPr>
-                <w:t>n</w:t>
-              </w:r>
-              <w:r>
-                <w:rPr>
-                  <w:rStyle w:val="Hyperlink"/>
-                </w:rPr>
-                <w:t>tac</w:t>
-              </w:r>
-              <w:r>
-                <w:rPr>
-                  <w:rStyle w:val="Hyperlink"/>
-                </w:rPr>
-                <w:t>t</w:t>
-              </w:r>
-              <w:r>
-                <w:rPr>
-                  <w:rStyle w:val="Hyperlink"/>
-                </w:rPr>
-                <w:t xml:space="preserve"> </w:t>
-              </w:r>
-              <w:r>
-                <w:rPr>
-                  <w:rStyle w:val="Hyperlink"/>
-                </w:rPr>
-                <w:t>CSED</w:t>
-              </w:r>
-            </w:hyperlink>
-            <w:r>
               <w:t xml:space="preserve"> to see if you have an account.</w:t>
             </w:r>
           </w:p>
@@ -5905,7 +5565,6 @@
               <w:pStyle w:val="Body"/>
             </w:pPr>
             <w:r>
-              <w:lastRenderedPageBreak/>
               <w:t xml:space="preserve">If you do not have an account, </w:t>
             </w:r>
             <w:hyperlink r:id="rId74" w:anchor="2" w:history="1">
@@ -6007,6 +5666,7 @@
               <w:rPr>
                 <w:rFonts w:ascii="Segoe UI Symbol" w:hAnsi="Segoe UI Symbol" w:cs="Segoe UI Symbol"/>
               </w:rPr>
+              <w:lastRenderedPageBreak/>
               <w:t>✆</w:t>
             </w:r>
             <w:r>
@@ -6063,19 +5723,7 @@
                 <w:rPr>
                   <w:rStyle w:val="Hyperlink"/>
                 </w:rPr>
-                <w:t>Child Suppo</w:t>
-              </w:r>
-              <w:r>
-                <w:rPr>
-                  <w:rStyle w:val="Hyperlink"/>
-                </w:rPr>
-                <w:t>r</w:t>
-              </w:r>
-              <w:r>
-                <w:rPr>
-                  <w:rStyle w:val="Hyperlink"/>
-                </w:rPr>
-                <w:t>t Enforcement FAQ</w:t>
+                <w:t>Child Support Enforcement FAQ</w:t>
               </w:r>
             </w:hyperlink>
           </w:p>
@@ -6226,23 +5874,7 @@
                   <w:rStyle w:val="Hyperlink"/>
                   <w:spacing w:val="0"/>
                 </w:rPr>
-                <w:t>acf.hhs.gov/</w:t>
-              </w:r>
-              <w:proofErr w:type="spellStart"/>
-              <w:r>
-                <w:rPr>
-                  <w:rStyle w:val="Hyperlink"/>
-                  <w:spacing w:val="0"/>
-                </w:rPr>
-                <w:t>css</w:t>
-              </w:r>
-              <w:proofErr w:type="spellEnd"/>
-              <w:r>
-                <w:rPr>
-                  <w:rStyle w:val="Hyperlink"/>
-                  <w:spacing w:val="0"/>
-                </w:rPr>
-                <w:t>/parents/find-local-child-support-office</w:t>
+                <w:t>acf.hhs.gov/css/parents/find-local-child-support-office</w:t>
               </w:r>
             </w:hyperlink>
           </w:p>
@@ -6374,10 +6006,7 @@
               <w:t>step</w:t>
             </w:r>
             <w:r>
-              <w:t xml:space="preserve"> </w:t>
-            </w:r>
-            <w:r>
-              <w:t xml:space="preserve">from </w:t>
+              <w:t xml:space="preserve"> from </w:t>
             </w:r>
             <w:hyperlink r:id="rId85" w:history="1">
               <w:r>
@@ -6413,19 +6042,7 @@
               <w:outlineLvl w:val="1"/>
             </w:pPr>
             <w:r>
-              <w:t xml:space="preserve">{{ </w:t>
-            </w:r>
-            <w:proofErr w:type="spellStart"/>
-            <w:r>
-              <w:t>register_order</w:t>
-            </w:r>
-            <w:r>
-              <w:lastRenderedPageBreak/>
-              <w:t>_step.subject</w:t>
-            </w:r>
-            <w:proofErr w:type="spellEnd"/>
-            <w:r>
-              <w:t xml:space="preserve"> }}</w:t>
+              <w:t>{{ register_order_step.subject }}</w:t>
             </w:r>
           </w:p>
         </w:tc>
@@ -6443,11 +6060,7 @@
               <w:pStyle w:val="Body"/>
             </w:pPr>
             <w:r>
-              <w:lastRenderedPageBreak/>
-              <w:t>{{p (include_docx_template("docassemble.AKA2JBranding:</w:t>
-            </w:r>
-            <w:r>
-              <w:t>register_order</w:t>
+              <w:t>{{p (include_docx_template("docassemble.AKA2JBranding:register_order</w:t>
             </w:r>
             <w:r>
               <w:t>_</w:t>
@@ -6479,6 +6092,7 @@
               <w:pStyle w:val="Body"/>
             </w:pPr>
             <w:r>
+              <w:lastRenderedPageBreak/>
               <w:t>{%tr endif %}</w:t>
             </w:r>
           </w:p>
@@ -6579,11 +6193,9 @@
             <w:pPr>
               <w:pStyle w:val="Body"/>
             </w:pPr>
-            <w:proofErr w:type="spellStart"/>
             <w:r>
               <w:t>talk_w_other_parent_step</w:t>
             </w:r>
-            <w:proofErr w:type="spellEnd"/>
             <w:r>
               <w:br/>
               <w:t>2026-08-10</w:t>
@@ -6612,16 +6224,11 @@
             <w:r>
               <w:t xml:space="preserve">{{ </w:t>
             </w:r>
-            <w:proofErr w:type="spellStart"/>
             <w:r>
               <w:t>talk_w_other_parent_step</w:t>
             </w:r>
             <w:r>
-              <w:t>.subject</w:t>
-            </w:r>
-            <w:proofErr w:type="spellEnd"/>
-            <w:r>
-              <w:t xml:space="preserve"> }}</w:t>
+              <w:t>.subject }}</w:t>
             </w:r>
           </w:p>
         </w:tc>
@@ -6680,15 +6287,7 @@
               <w:pStyle w:val="ListParagraph"/>
             </w:pPr>
             <w:r>
-              <w:t xml:space="preserve">Tell them if they do not do </w:t>
-            </w:r>
-            <w:proofErr w:type="gramStart"/>
-            <w:r>
-              <w:t>it</w:t>
-            </w:r>
-            <w:proofErr w:type="gramEnd"/>
-            <w:r>
-              <w:t xml:space="preserve"> you will ask the judge to enforce the order.</w:t>
+              <w:t>Tell them if they do not do it you will ask the judge to enforce the order.</w:t>
             </w:r>
           </w:p>
           <w:p>
@@ -6799,11 +6398,7 @@
               <w:t xml:space="preserve"> </w:t>
             </w:r>
             <w:r>
-              <w:t xml:space="preserve">in ('enforce AK order', 'enforce foreign </w:t>
-            </w:r>
-            <w:r>
-              <w:lastRenderedPageBreak/>
-              <w:t>order')</w:t>
+              <w:t>in ('enforce AK order', 'enforce foreign order')</w:t>
             </w:r>
             <w:r>
               <w:t xml:space="preserve"> </w:t>
@@ -6826,12 +6421,9 @@
             <w:pPr>
               <w:pStyle w:val="Body"/>
             </w:pPr>
-            <w:proofErr w:type="spellStart"/>
-            <w:r>
-              <w:lastRenderedPageBreak/>
+            <w:r>
               <w:t>court_to_enforce_step</w:t>
             </w:r>
-            <w:proofErr w:type="spellEnd"/>
             <w:r>
               <w:br/>
               <w:t>2026-08-10</w:t>
@@ -6858,9 +6450,9 @@
               <w:outlineLvl w:val="1"/>
             </w:pPr>
             <w:r>
+              <w:lastRenderedPageBreak/>
               <w:t xml:space="preserve">{{ </w:t>
             </w:r>
-            <w:proofErr w:type="spellStart"/>
             <w:r>
               <w:t>court_to_enforce</w:t>
             </w:r>
@@ -6868,11 +6460,7 @@
               <w:t>_step</w:t>
             </w:r>
             <w:r>
-              <w:t>.subject</w:t>
-            </w:r>
-            <w:proofErr w:type="spellEnd"/>
-            <w:r>
-              <w:t xml:space="preserve"> }}</w:t>
+              <w:t>.subject }}</w:t>
             </w:r>
           </w:p>
         </w:tc>
@@ -7343,58 +6931,61 @@
               <w:pStyle w:val="Exampleparagraph"/>
             </w:pPr>
             <w:r>
-              <w:t xml:space="preserve">If you fill out your forms on a computer and file them with TrueFiling, you can sign your forms electronically. Type “/s/ your name” on the signature line. For example, Zoe Lee’s signature would be "/s/ Zoe </w:t>
-            </w:r>
-            <w:r>
+              <w:t>If you fill out your forms on a computer and file them with TrueFiling, you can sign your forms electronically. Type “/s/ your name” on the signature line. For example, Zoe Lee’s signature would be "/s/ Zoe Lee."</w:t>
+            </w:r>
+          </w:p>
+          <w:p>
+            <w:pPr>
+              <w:pStyle w:val="Body"/>
+            </w:pPr>
+            <w:r>
+              <w:rPr>
+                <w:color w:val="FFC000"/>
+              </w:rPr>
+              <w:t>{%p</w:t>
+            </w:r>
+            <w:r>
+              <w:rPr>
+                <w:color w:val="FFC000"/>
+              </w:rPr>
+              <w:t xml:space="preserve"> if</w:t>
+            </w:r>
+            <w:r>
+              <w:rPr>
+                <w:color w:val="FFC000"/>
+              </w:rPr>
+              <w:t xml:space="preserve"> </w:t>
+            </w:r>
+            <w:r>
+              <w:rPr>
+                <w:color w:val="FFC000"/>
+              </w:rPr>
+              <w:t>filling_manner == 'electronically'</w:t>
+            </w:r>
+            <w:r>
+              <w:rPr>
+                <w:color w:val="FFC000"/>
+              </w:rPr>
+              <w:t xml:space="preserve"> and</w:t>
+            </w:r>
+            <w:r>
+              <w:rPr>
+                <w:color w:val="FFC000"/>
+              </w:rPr>
+              <w:t xml:space="preserve"> filing_method == 'efiling'</w:t>
+            </w:r>
+            <w:r>
+              <w:rPr>
+                <w:color w:val="FFC000"/>
+              </w:rPr>
+              <w:t xml:space="preserve"> </w:t>
+            </w:r>
+            <w:r>
+              <w:rPr>
+                <w:color w:val="FFC000"/>
+              </w:rPr>
               <w:lastRenderedPageBreak/>
-              <w:t>Lee."</w:t>
-            </w:r>
-          </w:p>
-          <w:p>
-            <w:pPr>
-              <w:pStyle w:val="Body"/>
-            </w:pPr>
-            <w:r>
-              <w:rPr>
-                <w:color w:val="FFC000"/>
-              </w:rPr>
-              <w:t>{%p</w:t>
-            </w:r>
-            <w:r>
-              <w:rPr>
-                <w:color w:val="FFC000"/>
-              </w:rPr>
-              <w:t xml:space="preserve"> if</w:t>
-            </w:r>
-            <w:r>
-              <w:rPr>
-                <w:color w:val="FFC000"/>
-              </w:rPr>
-              <w:t xml:space="preserve"> </w:t>
-            </w:r>
-            <w:r>
-              <w:rPr>
-                <w:color w:val="FFC000"/>
-              </w:rPr>
-              <w:t>filling_manner == 'electronically'</w:t>
-            </w:r>
-            <w:r>
-              <w:rPr>
-                <w:color w:val="FFC000"/>
-              </w:rPr>
-              <w:t xml:space="preserve"> and</w:t>
-            </w:r>
-            <w:r>
-              <w:rPr>
-                <w:color w:val="FFC000"/>
-              </w:rPr>
-              <w:t xml:space="preserve"> filing_method == 'efiling'</w:t>
-            </w:r>
-            <w:r>
-              <w:rPr>
-                <w:color w:val="FFC000"/>
-              </w:rPr>
-              <w:t xml:space="preserve"> %}</w:t>
+              <w:t>%}</w:t>
             </w:r>
           </w:p>
           <w:p>
@@ -8003,6 +7594,7 @@
               <w:rPr>
                 <w:color w:val="FF0000"/>
               </w:rPr>
+              <w:lastRenderedPageBreak/>
               <w:t>{%p</w:t>
             </w:r>
             <w:r>
@@ -8053,23 +7645,7 @@
                   <w:bCs/>
                   <w:spacing w:val="0"/>
                 </w:rPr>
-                <w:t>Coll</w:t>
-              </w:r>
-              <w:r>
-                <w:rPr>
-                  <w:rStyle w:val="Hyperlink"/>
-                  <w:bCs/>
-                  <w:spacing w:val="0"/>
-                </w:rPr>
-                <w:t>e</w:t>
-              </w:r>
-              <w:r>
-                <w:rPr>
-                  <w:rStyle w:val="Hyperlink"/>
-                  <w:bCs/>
-                  <w:spacing w:val="0"/>
-                </w:rPr>
-                <w:t>cting money owed to you</w:t>
+                <w:t>Collecting money owed to you</w:t>
               </w:r>
             </w:hyperlink>
             <w:r>
@@ -8151,97 +7727,50 @@
               <w:rPr>
                 <w:color w:val="FF0000"/>
               </w:rPr>
-              <w:t xml:space="preserve">{%tr if </w:t>
+              <w:t>{%tr if (</w:t>
+            </w:r>
+            <w:r>
+              <w:rPr>
+                <w:color w:val="FFC000"/>
+              </w:rPr>
+              <w:t>interim_order_date_within_10_days or interim_order_date_more_than_10_days or unknown_interim_date in('reconsider', 'modify', ‘both’) or final_order_date_within_10_days or final_order_date_within_30_days or final_order_date_more_30_days or unknown_final_date.any_true('reconsider','set aside') or (</w:t>
+            </w:r>
+            <w:r>
+              <w:rPr>
+                <w:color w:val="92D050"/>
+              </w:rPr>
+              <w:t>why_change == 'income' and not parents_agree and not middle_of_case</w:t>
+            </w:r>
+            <w:r>
+              <w:rPr>
+                <w:color w:val="FFC000"/>
+              </w:rPr>
+              <w:t>) or user_need in ('enforce AK order', 'enforce foreign order')</w:t>
             </w:r>
             <w:r>
               <w:rPr>
                 <w:color w:val="FF0000"/>
               </w:rPr>
+              <w:t>) and (</w:t>
+            </w:r>
+            <w:r>
+              <w:rPr>
+                <w:color w:val="FFC000"/>
+              </w:rPr>
               <w:t>(</w:t>
             </w:r>
             <w:r>
               <w:rPr>
-                <w:color w:val="FFC000"/>
-              </w:rPr>
-              <w:t xml:space="preserve">interim_order_date_within_10_days or interim_order_date_more_than_10_days or </w:t>
-            </w:r>
-            <w:proofErr w:type="spellStart"/>
-            <w:r>
-              <w:rPr>
-                <w:color w:val="FFC000"/>
-              </w:rPr>
-              <w:t>unknown_interim_date</w:t>
-            </w:r>
-            <w:proofErr w:type="spellEnd"/>
-            <w:r>
-              <w:rPr>
-                <w:color w:val="FFC000"/>
-              </w:rPr>
-              <w:t xml:space="preserve"> in('reconsider', 'modify', ‘both’) or final_order_date_within_10_days or final_order_date_within_30_days or final_order_date_more_30_days or </w:t>
-            </w:r>
-            <w:proofErr w:type="spellStart"/>
-            <w:r>
-              <w:rPr>
-                <w:color w:val="FFC000"/>
-              </w:rPr>
-              <w:t>unknown_final_date.any_true</w:t>
-            </w:r>
-            <w:proofErr w:type="spellEnd"/>
-            <w:r>
-              <w:rPr>
-                <w:color w:val="FFC000"/>
-              </w:rPr>
-              <w:t>('</w:t>
-            </w:r>
-            <w:proofErr w:type="spellStart"/>
-            <w:r>
-              <w:rPr>
-                <w:color w:val="FFC000"/>
-              </w:rPr>
-              <w:t>reconsider','set</w:t>
-            </w:r>
-            <w:proofErr w:type="spellEnd"/>
-            <w:r>
-              <w:rPr>
-                <w:color w:val="FFC000"/>
-              </w:rPr>
-              <w:t xml:space="preserve"> aside') or (</w:t>
-            </w:r>
-            <w:r>
-              <w:rPr>
                 <w:color w:val="92D050"/>
               </w:rPr>
-              <w:t>why_change == 'income' and not parents_agree and not middle_of_case</w:t>
-            </w:r>
-            <w:r>
-              <w:rPr>
-                <w:color w:val="FFC000"/>
-              </w:rPr>
-              <w:t>) or user_need in ('enforce AK order', 'enforce foreign order')</w:t>
-            </w:r>
-            <w:r>
-              <w:rPr>
-                <w:color w:val="FF0000"/>
-              </w:rPr>
-              <w:t xml:space="preserve">) and </w:t>
-            </w:r>
-            <w:r>
-              <w:rPr>
-                <w:color w:val="FF0000"/>
-              </w:rPr>
-              <w:t>(</w:t>
-            </w:r>
-            <w:r>
-              <w:rPr>
-                <w:color w:val="FFC000"/>
-              </w:rPr>
-              <w:t>(</w:t>
+              <w:t xml:space="preserve">filling_manner in('paper', 'dunno') or filing_method in ('mail or in person', </w:t>
             </w:r>
             <w:r>
               <w:rPr>
                 <w:color w:val="92D050"/>
               </w:rPr>
-              <w:t>filling_manner in('paper', 'dunno') or filing_method in ('mail or in person', ‘dunno’)</w:t>
+              <w:lastRenderedPageBreak/>
+              <w:t>‘dunno’)</w:t>
             </w:r>
             <w:r>
               <w:rPr>
@@ -8271,6 +7800,7 @@
               <w:pStyle w:val="Body"/>
             </w:pPr>
             <w:r>
+              <w:lastRenderedPageBreak/>
               <w:t>sign_step</w:t>
             </w:r>
             <w:r>
@@ -8295,6 +7825,7 @@
           <w:p>
             <w:pPr>
               <w:pStyle w:val="Heading2"/>
+              <w:outlineLvl w:val="1"/>
             </w:pPr>
             <w:r>
               <w:t>{{ sign_step.subject }}</w:t>
@@ -8380,49 +7911,7 @@
               <w:rPr>
                 <w:color w:val="FF0000"/>
               </w:rPr>
-              <w:t xml:space="preserve">{%tr if interim_order_date_within_10_days or interim_order_date_more_than_10_days or </w:t>
-            </w:r>
-            <w:proofErr w:type="spellStart"/>
-            <w:r>
-              <w:rPr>
-                <w:color w:val="FF0000"/>
-              </w:rPr>
-              <w:t>unknown_interim_date</w:t>
-            </w:r>
-            <w:proofErr w:type="spellEnd"/>
-            <w:r>
-              <w:rPr>
-                <w:color w:val="FF0000"/>
-              </w:rPr>
-              <w:t xml:space="preserve"> in('reconsider', 'modify', ‘both’) or final_order_date_within_10_days or final_order_date_within_30_days or final_order_date_more_30_days or </w:t>
-            </w:r>
-            <w:proofErr w:type="spellStart"/>
-            <w:r>
-              <w:rPr>
-                <w:color w:val="FF0000"/>
-              </w:rPr>
-              <w:t>unknown_final_date.any_true</w:t>
-            </w:r>
-            <w:proofErr w:type="spellEnd"/>
-            <w:r>
-              <w:rPr>
-                <w:color w:val="FF0000"/>
-              </w:rPr>
-              <w:t>('</w:t>
-            </w:r>
-            <w:proofErr w:type="spellStart"/>
-            <w:r>
-              <w:rPr>
-                <w:color w:val="FF0000"/>
-              </w:rPr>
-              <w:t>reconsider','set</w:t>
-            </w:r>
-            <w:proofErr w:type="spellEnd"/>
-            <w:r>
-              <w:rPr>
-                <w:color w:val="FF0000"/>
-              </w:rPr>
-              <w:t xml:space="preserve"> aside') or (</w:t>
+              <w:t>{%tr if interim_order_date_within_10_days or interim_order_date_more_than_10_days or unknown_interim_date in('reconsider', 'modify', ‘both’) or final_order_date_within_10_days or final_order_date_within_30_days or final_order_date_more_30_days or unknown_final_date.any_true('reconsider','set aside') or (</w:t>
             </w:r>
             <w:r>
               <w:rPr>
@@ -8452,13 +7941,7 @@
               <w:pStyle w:val="Body"/>
             </w:pPr>
             <w:r>
-              <w:t>truefiling_file_and_serve_</w:t>
-            </w:r>
-            <w:r>
-              <w:t xml:space="preserve">step </w:t>
-            </w:r>
-            <w:r>
-              <w:t>docx</w:t>
+              <w:t>truefiling_file_and_serve_step docx</w:t>
             </w:r>
             <w:r>
               <w:t xml:space="preserve"> </w:t>
@@ -8488,8 +7971,11 @@
               <w:outlineLvl w:val="1"/>
             </w:pPr>
             <w:r>
+              <w:t xml:space="preserve">{{ </w:t>
+            </w:r>
+            <w:r>
               <w:lastRenderedPageBreak/>
-              <w:t>{{ truefiling_file_and_serve_step.subject }}</w:t>
+              <w:t>truefiling_file_and_serve_step.subject }}</w:t>
             </w:r>
           </w:p>
         </w:tc>
@@ -8507,7 +7993,12 @@
               <w:pStyle w:val="Body"/>
             </w:pPr>
             <w:r>
-              <w:t>{{p (include_docx_template("docassemble.AKA2JBranding:truefiling_file_and_serve_content.docx")) }}</w:t>
+              <w:lastRenderedPageBreak/>
+              <w:t>{{p (include_docx_template("docassemble.AKA2JBranding:truefiling_file</w:t>
+            </w:r>
+            <w:r>
+              <w:lastRenderedPageBreak/>
+              <w:t>_and_serve_content.docx")) }}</w:t>
             </w:r>
           </w:p>
         </w:tc>
@@ -8576,7 +8067,6 @@
               <w:rPr>
                 <w:color w:val="FF0000"/>
               </w:rPr>
-              <w:lastRenderedPageBreak/>
               <w:t>{%tr endif %}</w:t>
             </w:r>
           </w:p>
@@ -8641,13 +8131,8 @@
             <w:r>
               <w:br/>
             </w:r>
-            <w:proofErr w:type="spellStart"/>
-            <w:r>
-              <w:t>unknown_interim_date</w:t>
-            </w:r>
-            <w:proofErr w:type="spellEnd"/>
-            <w:r>
-              <w:t xml:space="preserve"> == 'modify'</w:t>
+            <w:r>
+              <w:t>unknown_interim_date == 'modify'</w:t>
             </w:r>
             <w:r>
               <w:rPr>
@@ -8676,13 +8161,8 @@
             <w:r>
               <w:br/>
             </w:r>
-            <w:proofErr w:type="spellStart"/>
-            <w:r>
-              <w:t>unknown_interim_date</w:t>
-            </w:r>
-            <w:proofErr w:type="spellEnd"/>
-            <w:r>
-              <w:t xml:space="preserve"> == '</w:t>
+            <w:r>
+              <w:t>unknown_interim_date == '</w:t>
             </w:r>
             <w:r>
               <w:t>both</w:t>
@@ -8836,7 +8316,6 @@
               <w:rPr>
                 <w:color w:val="00B0F0"/>
               </w:rPr>
-              <w:lastRenderedPageBreak/>
               <w:t>%}</w:t>
             </w:r>
           </w:p>
@@ -8854,12 +8333,9 @@
             <w:pPr>
               <w:pStyle w:val="Body"/>
             </w:pPr>
-            <w:proofErr w:type="spellStart"/>
-            <w:r>
-              <w:lastRenderedPageBreak/>
+            <w:r>
               <w:t>expect_after_motion_step</w:t>
             </w:r>
-            <w:proofErr w:type="spellEnd"/>
             <w:r>
               <w:t xml:space="preserve"> from </w:t>
             </w:r>
@@ -8897,21 +8373,8 @@
               <w:rPr>
                 <w:rFonts w:eastAsia="Calibri"/>
               </w:rPr>
-              <w:t xml:space="preserve">{{ </w:t>
-            </w:r>
-            <w:proofErr w:type="spellStart"/>
-            <w:r>
-              <w:rPr>
-                <w:rFonts w:eastAsia="Calibri"/>
-              </w:rPr>
-              <w:t>expect_after_motion_or_answer_step.subject</w:t>
-            </w:r>
-            <w:proofErr w:type="spellEnd"/>
-            <w:r>
-              <w:rPr>
-                <w:rFonts w:eastAsia="Calibri"/>
-              </w:rPr>
-              <w:t xml:space="preserve"> }}</w:t>
+              <w:lastRenderedPageBreak/>
+              <w:t>{{ expect_after_motion_or_answer_step.subject }}</w:t>
             </w:r>
           </w:p>
         </w:tc>
@@ -8955,7 +8418,6 @@
               <w:rPr>
                 <w:color w:val="00B0F0"/>
               </w:rPr>
-              <w:lastRenderedPageBreak/>
               <w:t>{%tr endif %}</w:t>
             </w:r>
           </w:p>
@@ -9006,15 +8468,7 @@
               <w:t>or</w:t>
             </w:r>
             <w:r>
-              <w:t xml:space="preserve"> </w:t>
-            </w:r>
-            <w:proofErr w:type="spellStart"/>
-            <w:r>
-              <w:t>unknown_interim_date</w:t>
-            </w:r>
-            <w:proofErr w:type="spellEnd"/>
-            <w:r>
-              <w:t xml:space="preserve"> in(</w:t>
+              <w:t xml:space="preserve"> unknown_interim_date in(</w:t>
             </w:r>
             <w:r>
               <w:t>'</w:t>
@@ -9088,11 +8542,9 @@
             <w:pPr>
               <w:pStyle w:val="Body"/>
             </w:pPr>
-            <w:proofErr w:type="spellStart"/>
             <w:r>
               <w:t>expect_reconsider_step</w:t>
             </w:r>
-            <w:proofErr w:type="spellEnd"/>
             <w:r>
               <w:t xml:space="preserve"> from </w:t>
             </w:r>
@@ -9127,15 +8579,7 @@
               <w:outlineLvl w:val="1"/>
             </w:pPr>
             <w:r>
-              <w:t xml:space="preserve">{{ </w:t>
-            </w:r>
-            <w:proofErr w:type="spellStart"/>
-            <w:r>
-              <w:t>expect_reconsider_step.subject</w:t>
-            </w:r>
-            <w:proofErr w:type="spellEnd"/>
-            <w:r>
-              <w:t xml:space="preserve"> }}</w:t>
+              <w:t>{{ expect_reconsider_step.subject }}</w:t>
             </w:r>
           </w:p>
         </w:tc>
@@ -9185,7 +8629,6 @@
               <w:pStyle w:val="Body"/>
             </w:pPr>
             <w:r>
-              <w:lastRenderedPageBreak/>
               <w:t>{%tr endif %}</w:t>
             </w:r>
           </w:p>
@@ -9203,11 +8646,9 @@
             <w:pPr>
               <w:pStyle w:val="Body"/>
             </w:pPr>
-            <w:proofErr w:type="spellStart"/>
             <w:r>
               <w:t>get_help</w:t>
             </w:r>
-            <w:proofErr w:type="spellEnd"/>
             <w:r>
               <w:t xml:space="preserve"> from </w:t>
             </w:r>
@@ -9243,15 +8684,7 @@
             </w:pPr>
             <w:bookmarkStart w:id="4" w:name="_Hlk136618706"/>
             <w:r>
-              <w:t xml:space="preserve">{{ </w:t>
-            </w:r>
-            <w:proofErr w:type="spellStart"/>
-            <w:r>
-              <w:t>get_help.subject</w:t>
-            </w:r>
-            <w:proofErr w:type="spellEnd"/>
-            <w:r>
-              <w:t xml:space="preserve"> }}</w:t>
+              <w:t>{{ get_help.subject }}</w:t>
             </w:r>
             <w:bookmarkEnd w:id="3"/>
           </w:p>
@@ -9297,7 +8730,12 @@
       </w:pPr>
     </w:p>
     <w:sectPr>
-      <w:footerReference w:type="default" r:id="rId115"/>
+      <w:headerReference w:type="even" r:id="rId115"/>
+      <w:headerReference w:type="default" r:id="rId116"/>
+      <w:footerReference w:type="even" r:id="rId117"/>
+      <w:footerReference w:type="default" r:id="rId118"/>
+      <w:headerReference w:type="first" r:id="rId119"/>
+      <w:footerReference w:type="first" r:id="rId120"/>
       <w:pgSz w:w="12240" w:h="15840"/>
       <w:pgMar w:top="245" w:right="1440" w:bottom="274" w:left="1440" w:header="720" w:footer="720" w:gutter="0"/>
       <w:cols w:space="720"/>
@@ -9331,6 +8769,16 @@
   <w:p>
     <w:pPr>
       <w:pStyle w:val="Footer"/>
+    </w:pPr>
+  </w:p>
+</w:ftr>
+</file>
+
+<file path=word/footer2.xml><?xml version="1.0" encoding="utf-8"?>
+<w:ftr xmlns:wpc="http://schemas.microsoft.com/office/word/2010/wordprocessingCanvas" xmlns:cx="http://schemas.microsoft.com/office/drawing/2014/chartex" xmlns:cx1="http://schemas.microsoft.com/office/drawing/2015/9/8/chartex" xmlns:cx2="http://schemas.microsoft.com/office/drawing/2015/10/21/chartex" xmlns:cx3="http://schemas.microsoft.com/office/drawing/2016/5/9/chartex" xmlns:cx4="http://schemas.microsoft.com/office/drawing/2016/5/10/chartex" xmlns:cx5="http://schemas.microsoft.com/office/drawing/2016/5/11/chartex" xmlns:cx6="http://schemas.microsoft.com/office/drawing/2016/5/12/chartex" xmlns:cx7="http://schemas.microsoft.com/office/drawing/2016/5/13/chartex" xmlns:cx8="http://schemas.microsoft.com/office/drawing/2016/5/14/chartex" xmlns:mc="http://schemas.openxmlformats.org/markup-compatibility/2006" xmlns:aink="http://schemas.microsoft.com/office/drawing/2016/ink" xmlns:am3d="http://schemas.microsoft.com/office/drawing/2017/model3d" xmlns:o="urn:schemas-microsoft-com:office:office" xmlns:r="http://schemas.openxmlformats.org/officeDocument/2006/relationships" xmlns:m="http://schemas.openxmlformats.org/officeDocument/2006/math" xmlns:v="urn:schemas-microsoft-com:vml" xmlns:wp14="http://schemas.microsoft.com/office/word/2010/wordprocessingDrawing" xmlns:wp="http://schemas.openxmlformats.org/drawingml/2006/wordprocessingDrawing" xmlns:w10="urn:schemas-microsoft-com:office:word" xmlns:w="http://schemas.openxmlformats.org/wordprocessingml/2006/main" xmlns:w14="http://schemas.microsoft.com/office/word/2010/wordml" xmlns:w15="http://schemas.microsoft.com/office/word/2012/wordml" xmlns:w16cex="http://schemas.microsoft.com/office/word/2018/wordml/cex" xmlns:w16cid="http://schemas.microsoft.com/office/word/2016/wordml/cid" xmlns:w16="http://schemas.microsoft.com/office/word/2018/wordml" xmlns:w16sdtdh="http://schemas.microsoft.com/office/word/2020/wordml/sdtdatahash" xmlns:w16se="http://schemas.microsoft.com/office/word/2015/wordml/symex" xmlns:wpg="http://schemas.microsoft.com/office/word/2010/wordprocessingGroup" xmlns:wpi="http://schemas.microsoft.com/office/word/2010/wordprocessingInk" xmlns:wne="http://schemas.microsoft.com/office/word/2006/wordml" xmlns:wps="http://schemas.microsoft.com/office/word/2010/wordprocessingShape" mc:Ignorable="w14 w15 w16se w16cid w16 w16cex w16sdtdh wp14">
+  <w:p>
+    <w:pPr>
+      <w:pStyle w:val="Footer"/>
       <w:spacing w:before="0" w:beforeAutospacing="0" w:after="0" w:afterAutospacing="0"/>
       <w:jc w:val="right"/>
     </w:pPr>
@@ -9387,7 +8835,10 @@
       <w:ind w:left="-450"/>
     </w:pPr>
     <w:r>
-      <w:t>August 10</w:t>
+      <w:t>August 1</w:t>
+    </w:r>
+    <w:r>
+      <w:t>2</w:t>
     </w:r>
     <w:r>
       <w:t>, 202</w:t>
@@ -9395,6 +8846,16 @@
     <w:r>
       <w:t>6</w:t>
     </w:r>
+  </w:p>
+</w:ftr>
+</file>
+
+<file path=word/footer3.xml><?xml version="1.0" encoding="utf-8"?>
+<w:ftr xmlns:wpc="http://schemas.microsoft.com/office/word/2010/wordprocessingCanvas" xmlns:cx="http://schemas.microsoft.com/office/drawing/2014/chartex" xmlns:cx1="http://schemas.microsoft.com/office/drawing/2015/9/8/chartex" xmlns:cx2="http://schemas.microsoft.com/office/drawing/2015/10/21/chartex" xmlns:cx3="http://schemas.microsoft.com/office/drawing/2016/5/9/chartex" xmlns:cx4="http://schemas.microsoft.com/office/drawing/2016/5/10/chartex" xmlns:cx5="http://schemas.microsoft.com/office/drawing/2016/5/11/chartex" xmlns:cx6="http://schemas.microsoft.com/office/drawing/2016/5/12/chartex" xmlns:cx7="http://schemas.microsoft.com/office/drawing/2016/5/13/chartex" xmlns:cx8="http://schemas.microsoft.com/office/drawing/2016/5/14/chartex" xmlns:mc="http://schemas.openxmlformats.org/markup-compatibility/2006" xmlns:aink="http://schemas.microsoft.com/office/drawing/2016/ink" xmlns:am3d="http://schemas.microsoft.com/office/drawing/2017/model3d" xmlns:o="urn:schemas-microsoft-com:office:office" xmlns:r="http://schemas.openxmlformats.org/officeDocument/2006/relationships" xmlns:m="http://schemas.openxmlformats.org/officeDocument/2006/math" xmlns:v="urn:schemas-microsoft-com:vml" xmlns:wp14="http://schemas.microsoft.com/office/word/2010/wordprocessingDrawing" xmlns:wp="http://schemas.openxmlformats.org/drawingml/2006/wordprocessingDrawing" xmlns:w10="urn:schemas-microsoft-com:office:word" xmlns:w="http://schemas.openxmlformats.org/wordprocessingml/2006/main" xmlns:w14="http://schemas.microsoft.com/office/word/2010/wordml" xmlns:w15="http://schemas.microsoft.com/office/word/2012/wordml" xmlns:w16cex="http://schemas.microsoft.com/office/word/2018/wordml/cex" xmlns:w16cid="http://schemas.microsoft.com/office/word/2016/wordml/cid" xmlns:w16="http://schemas.microsoft.com/office/word/2018/wordml" xmlns:w16sdtdh="http://schemas.microsoft.com/office/word/2020/wordml/sdtdatahash" xmlns:w16se="http://schemas.microsoft.com/office/word/2015/wordml/symex" xmlns:wpg="http://schemas.microsoft.com/office/word/2010/wordprocessingGroup" xmlns:wpi="http://schemas.microsoft.com/office/word/2010/wordprocessingInk" xmlns:wne="http://schemas.microsoft.com/office/word/2006/wordml" xmlns:wps="http://schemas.microsoft.com/office/word/2010/wordprocessingShape" mc:Ignorable="w14 w15 w16se w16cid w16 w16cex w16sdtdh wp14">
+  <w:p>
+    <w:pPr>
+      <w:pStyle w:val="Footer"/>
+    </w:pPr>
   </w:p>
 </w:ftr>
 </file>
@@ -9416,6 +8877,36 @@
     </w:p>
   </w:footnote>
 </w:footnotes>
+</file>
+
+<file path=word/header1.xml><?xml version="1.0" encoding="utf-8"?>
+<w:hdr xmlns:wpc="http://schemas.microsoft.com/office/word/2010/wordprocessingCanvas" xmlns:cx="http://schemas.microsoft.com/office/drawing/2014/chartex" xmlns:cx1="http://schemas.microsoft.com/office/drawing/2015/9/8/chartex" xmlns:cx2="http://schemas.microsoft.com/office/drawing/2015/10/21/chartex" xmlns:cx3="http://schemas.microsoft.com/office/drawing/2016/5/9/chartex" xmlns:cx4="http://schemas.microsoft.com/office/drawing/2016/5/10/chartex" xmlns:cx5="http://schemas.microsoft.com/office/drawing/2016/5/11/chartex" xmlns:cx6="http://schemas.microsoft.com/office/drawing/2016/5/12/chartex" xmlns:cx7="http://schemas.microsoft.com/office/drawing/2016/5/13/chartex" xmlns:cx8="http://schemas.microsoft.com/office/drawing/2016/5/14/chartex" xmlns:mc="http://schemas.openxmlformats.org/markup-compatibility/2006" xmlns:aink="http://schemas.microsoft.com/office/drawing/2016/ink" xmlns:am3d="http://schemas.microsoft.com/office/drawing/2017/model3d" xmlns:o="urn:schemas-microsoft-com:office:office" xmlns:r="http://schemas.openxmlformats.org/officeDocument/2006/relationships" xmlns:m="http://schemas.openxmlformats.org/officeDocument/2006/math" xmlns:v="urn:schemas-microsoft-com:vml" xmlns:wp14="http://schemas.microsoft.com/office/word/2010/wordprocessingDrawing" xmlns:wp="http://schemas.openxmlformats.org/drawingml/2006/wordprocessingDrawing" xmlns:w10="urn:schemas-microsoft-com:office:word" xmlns:w="http://schemas.openxmlformats.org/wordprocessingml/2006/main" xmlns:w14="http://schemas.microsoft.com/office/word/2010/wordml" xmlns:w15="http://schemas.microsoft.com/office/word/2012/wordml" xmlns:w16cex="http://schemas.microsoft.com/office/word/2018/wordml/cex" xmlns:w16cid="http://schemas.microsoft.com/office/word/2016/wordml/cid" xmlns:w16="http://schemas.microsoft.com/office/word/2018/wordml" xmlns:w16sdtdh="http://schemas.microsoft.com/office/word/2020/wordml/sdtdatahash" xmlns:w16se="http://schemas.microsoft.com/office/word/2015/wordml/symex" xmlns:wpg="http://schemas.microsoft.com/office/word/2010/wordprocessingGroup" xmlns:wpi="http://schemas.microsoft.com/office/word/2010/wordprocessingInk" xmlns:wne="http://schemas.microsoft.com/office/word/2006/wordml" xmlns:wps="http://schemas.microsoft.com/office/word/2010/wordprocessingShape" mc:Ignorable="w14 w15 w16se w16cid w16 w16cex w16sdtdh wp14">
+  <w:p>
+    <w:pPr>
+      <w:pStyle w:val="Header"/>
+    </w:pPr>
+  </w:p>
+</w:hdr>
+</file>
+
+<file path=word/header2.xml><?xml version="1.0" encoding="utf-8"?>
+<w:hdr xmlns:wpc="http://schemas.microsoft.com/office/word/2010/wordprocessingCanvas" xmlns:cx="http://schemas.microsoft.com/office/drawing/2014/chartex" xmlns:cx1="http://schemas.microsoft.com/office/drawing/2015/9/8/chartex" xmlns:cx2="http://schemas.microsoft.com/office/drawing/2015/10/21/chartex" xmlns:cx3="http://schemas.microsoft.com/office/drawing/2016/5/9/chartex" xmlns:cx4="http://schemas.microsoft.com/office/drawing/2016/5/10/chartex" xmlns:cx5="http://schemas.microsoft.com/office/drawing/2016/5/11/chartex" xmlns:cx6="http://schemas.microsoft.com/office/drawing/2016/5/12/chartex" xmlns:cx7="http://schemas.microsoft.com/office/drawing/2016/5/13/chartex" xmlns:cx8="http://schemas.microsoft.com/office/drawing/2016/5/14/chartex" xmlns:mc="http://schemas.openxmlformats.org/markup-compatibility/2006" xmlns:aink="http://schemas.microsoft.com/office/drawing/2016/ink" xmlns:am3d="http://schemas.microsoft.com/office/drawing/2017/model3d" xmlns:o="urn:schemas-microsoft-com:office:office" xmlns:r="http://schemas.openxmlformats.org/officeDocument/2006/relationships" xmlns:m="http://schemas.openxmlformats.org/officeDocument/2006/math" xmlns:v="urn:schemas-microsoft-com:vml" xmlns:wp14="http://schemas.microsoft.com/office/word/2010/wordprocessingDrawing" xmlns:wp="http://schemas.openxmlformats.org/drawingml/2006/wordprocessingDrawing" xmlns:w10="urn:schemas-microsoft-com:office:word" xmlns:w="http://schemas.openxmlformats.org/wordprocessingml/2006/main" xmlns:w14="http://schemas.microsoft.com/office/word/2010/wordml" xmlns:w15="http://schemas.microsoft.com/office/word/2012/wordml" xmlns:w16cex="http://schemas.microsoft.com/office/word/2018/wordml/cex" xmlns:w16cid="http://schemas.microsoft.com/office/word/2016/wordml/cid" xmlns:w16="http://schemas.microsoft.com/office/word/2018/wordml" xmlns:w16sdtdh="http://schemas.microsoft.com/office/word/2020/wordml/sdtdatahash" xmlns:w16se="http://schemas.microsoft.com/office/word/2015/wordml/symex" xmlns:wpg="http://schemas.microsoft.com/office/word/2010/wordprocessingGroup" xmlns:wpi="http://schemas.microsoft.com/office/word/2010/wordprocessingInk" xmlns:wne="http://schemas.microsoft.com/office/word/2006/wordml" xmlns:wps="http://schemas.microsoft.com/office/word/2010/wordprocessingShape" mc:Ignorable="w14 w15 w16se w16cid w16 w16cex w16sdtdh wp14">
+  <w:p>
+    <w:pPr>
+      <w:pStyle w:val="Header"/>
+    </w:pPr>
+  </w:p>
+</w:hdr>
+</file>
+
+<file path=word/header3.xml><?xml version="1.0" encoding="utf-8"?>
+<w:hdr xmlns:wpc="http://schemas.microsoft.com/office/word/2010/wordprocessingCanvas" xmlns:cx="http://schemas.microsoft.com/office/drawing/2014/chartex" xmlns:cx1="http://schemas.microsoft.com/office/drawing/2015/9/8/chartex" xmlns:cx2="http://schemas.microsoft.com/office/drawing/2015/10/21/chartex" xmlns:cx3="http://schemas.microsoft.com/office/drawing/2016/5/9/chartex" xmlns:cx4="http://schemas.microsoft.com/office/drawing/2016/5/10/chartex" xmlns:cx5="http://schemas.microsoft.com/office/drawing/2016/5/11/chartex" xmlns:cx6="http://schemas.microsoft.com/office/drawing/2016/5/12/chartex" xmlns:cx7="http://schemas.microsoft.com/office/drawing/2016/5/13/chartex" xmlns:cx8="http://schemas.microsoft.com/office/drawing/2016/5/14/chartex" xmlns:mc="http://schemas.openxmlformats.org/markup-compatibility/2006" xmlns:aink="http://schemas.microsoft.com/office/drawing/2016/ink" xmlns:am3d="http://schemas.microsoft.com/office/drawing/2017/model3d" xmlns:o="urn:schemas-microsoft-com:office:office" xmlns:r="http://schemas.openxmlformats.org/officeDocument/2006/relationships" xmlns:m="http://schemas.openxmlformats.org/officeDocument/2006/math" xmlns:v="urn:schemas-microsoft-com:vml" xmlns:wp14="http://schemas.microsoft.com/office/word/2010/wordprocessingDrawing" xmlns:wp="http://schemas.openxmlformats.org/drawingml/2006/wordprocessingDrawing" xmlns:w10="urn:schemas-microsoft-com:office:word" xmlns:w="http://schemas.openxmlformats.org/wordprocessingml/2006/main" xmlns:w14="http://schemas.microsoft.com/office/word/2010/wordml" xmlns:w15="http://schemas.microsoft.com/office/word/2012/wordml" xmlns:w16cex="http://schemas.microsoft.com/office/word/2018/wordml/cex" xmlns:w16cid="http://schemas.microsoft.com/office/word/2016/wordml/cid" xmlns:w16="http://schemas.microsoft.com/office/word/2018/wordml" xmlns:w16sdtdh="http://schemas.microsoft.com/office/word/2020/wordml/sdtdatahash" xmlns:w16se="http://schemas.microsoft.com/office/word/2015/wordml/symex" xmlns:wpg="http://schemas.microsoft.com/office/word/2010/wordprocessingGroup" xmlns:wpi="http://schemas.microsoft.com/office/word/2010/wordprocessingInk" xmlns:wne="http://schemas.microsoft.com/office/word/2006/wordml" xmlns:wps="http://schemas.microsoft.com/office/word/2010/wordprocessingShape" mc:Ignorable="w14 w15 w16se w16cid w16 w16cex w16sdtdh wp14">
+  <w:p>
+    <w:pPr>
+      <w:pStyle w:val="Header"/>
+    </w:pPr>
+  </w:p>
+</w:hdr>
 </file>
 
 <file path=word/numbering.xml><?xml version="1.0" encoding="utf-8"?>

</xml_diff>

<commit_message>
Was getting Index Error - which indicates problem w  docx, sometimes space after colon in include statements, but also misnamed/none existent variables in include statement, this one was calling fill_aside_content, I fixed it call fill_set_aside_content
</commit_message>
<xml_diff>
--- a/docassemble/ChangingOrEnforcingYourChildSupportOrder/data/templates/changing_child_support_action_plan.docx
+++ b/docassemble/ChangingOrEnforcingYourChildSupportOrder/data/templates/changing_child_support_action_plan.docx
@@ -800,7 +800,15 @@
               <w:t xml:space="preserve">Your Action Plan in </w:t>
             </w:r>
             <w:r>
-              <w:t xml:space="preserve">{{ step_list | length }} </w:t>
+              <w:t xml:space="preserve">{{ </w:t>
+            </w:r>
+            <w:proofErr w:type="spellStart"/>
+            <w:r>
+              <w:t>step_list</w:t>
+            </w:r>
+            <w:proofErr w:type="spellEnd"/>
+            <w:r>
+              <w:t xml:space="preserve"> | length }} </w:t>
             </w:r>
             <w:r>
               <w:t>Steps</w:t>
@@ -877,11 +885,19 @@
               </w:rPr>
               <w:t>(</w:t>
             </w:r>
+            <w:proofErr w:type="spellStart"/>
             <w:r>
               <w:rPr>
                 <w:color w:val="00B050"/>
               </w:rPr>
-              <w:t>unknown_final_date.true_values()</w:t>
+              <w:t>unknown_final_date.true_values</w:t>
+            </w:r>
+            <w:proofErr w:type="spellEnd"/>
+            <w:r>
+              <w:rPr>
+                <w:color w:val="00B050"/>
+              </w:rPr>
+              <w:t>()</w:t>
             </w:r>
             <w:r>
               <w:rPr>
@@ -895,6 +911,7 @@
               </w:rPr>
               <w:t>|</w:t>
             </w:r>
+            <w:proofErr w:type="spellStart"/>
             <w:r>
               <w:rPr>
                 <w:color w:val="00B050"/>
@@ -913,6 +930,7 @@
               </w:rPr>
               <w:t>length</w:t>
             </w:r>
+            <w:proofErr w:type="spellEnd"/>
             <w:r>
               <w:rPr>
                 <w:color w:val="00B050"/>
@@ -950,6 +968,7 @@
               </w:rPr>
               <w:t xml:space="preserve"> </w:t>
             </w:r>
+            <w:proofErr w:type="spellStart"/>
             <w:r>
               <w:rPr>
                 <w:color w:val="00B050"/>
@@ -968,6 +987,7 @@
               </w:rPr>
               <w:t>resources</w:t>
             </w:r>
+            <w:proofErr w:type="spellEnd"/>
             <w:r>
               <w:rPr>
                 <w:color w:val="00B050"/>
@@ -981,11 +1001,19 @@
               <w:br/>
               <w:t xml:space="preserve">or </w:t>
             </w:r>
+            <w:proofErr w:type="spellStart"/>
             <w:r>
               <w:rPr>
                 <w:color w:val="00B050"/>
               </w:rPr>
-              <w:t>unknown_interim_date == 'both'</w:t>
+              <w:t>unknown_interim_date</w:t>
+            </w:r>
+            <w:proofErr w:type="spellEnd"/>
+            <w:r>
+              <w:rPr>
+                <w:color w:val="00B050"/>
+              </w:rPr>
+              <w:t xml:space="preserve"> == 'both'</w:t>
             </w:r>
             <w:bookmarkStart w:id="1" w:name="_Hlk143062850"/>
             <w:r>
@@ -1096,9 +1124,11 @@
             <w:pPr>
               <w:pStyle w:val="Body"/>
             </w:pPr>
+            <w:proofErr w:type="spellStart"/>
             <w:r>
               <w:t>pick_a_step_step</w:t>
             </w:r>
+            <w:proofErr w:type="spellEnd"/>
             <w:r>
               <w:t xml:space="preserve"> from </w:t>
             </w:r>
@@ -1138,11 +1168,16 @@
             <w:r>
               <w:t xml:space="preserve">{ </w:t>
             </w:r>
+            <w:proofErr w:type="spellStart"/>
             <w:r>
               <w:t>pick_a_step_step</w:t>
             </w:r>
             <w:r>
-              <w:t xml:space="preserve">.subject </w:t>
+              <w:t>.subject</w:t>
+            </w:r>
+            <w:proofErr w:type="spellEnd"/>
+            <w:r>
+              <w:t xml:space="preserve"> </w:t>
             </w:r>
             <w:r>
               <w:t>}</w:t>
@@ -1216,9 +1251,11 @@
             <w:pPr>
               <w:pStyle w:val="Body"/>
             </w:pPr>
+            <w:proofErr w:type="spellStart"/>
             <w:r>
               <w:t>ask_court_step</w:t>
             </w:r>
+            <w:proofErr w:type="spellEnd"/>
             <w:r>
               <w:br/>
             </w:r>
@@ -1297,13 +1334,21 @@
               <w:t>{</w:t>
             </w:r>
             <w:r>
-              <w:t>{ ask_court</w:t>
+              <w:t xml:space="preserve">{ </w:t>
+            </w:r>
+            <w:proofErr w:type="spellStart"/>
+            <w:r>
+              <w:t>ask_court</w:t>
             </w:r>
             <w:r>
               <w:t>_step</w:t>
             </w:r>
             <w:r>
-              <w:t xml:space="preserve">.subject </w:t>
+              <w:t>.subject</w:t>
+            </w:r>
+            <w:proofErr w:type="spellEnd"/>
+            <w:r>
+              <w:t xml:space="preserve"> </w:t>
             </w:r>
             <w:r>
               <w:t>}</w:t>
@@ -1440,8 +1485,17 @@
                   <w:rStyle w:val="Hyperlink"/>
                   <w:spacing w:val="0"/>
                 </w:rPr>
-                <w:t>.AKCourts.gov/start/ChangingChildCustody</w:t>
-              </w:r>
+                <w:t>.AKCourts.gov/start/</w:t>
+              </w:r>
+              <w:proofErr w:type="spellStart"/>
+              <w:r>
+                <w:rPr>
+                  <w:rStyle w:val="Hyperlink"/>
+                  <w:spacing w:val="0"/>
+                </w:rPr>
+                <w:t>ChangingChildCustody</w:t>
+              </w:r>
+              <w:proofErr w:type="spellEnd"/>
             </w:hyperlink>
           </w:p>
           <w:p>
@@ -1470,8 +1524,17 @@
                   <w:rStyle w:val="Hyperlink"/>
                   <w:spacing w:val="0"/>
                 </w:rPr>
-                <w:t>ak-courts.info/mtm</w:t>
-              </w:r>
+                <w:t>ak-courts.info/</w:t>
+              </w:r>
+              <w:proofErr w:type="spellStart"/>
+              <w:r>
+                <w:rPr>
+                  <w:rStyle w:val="Hyperlink"/>
+                  <w:spacing w:val="0"/>
+                </w:rPr>
+                <w:t>mtm</w:t>
+              </w:r>
+              <w:proofErr w:type="spellEnd"/>
             </w:hyperlink>
           </w:p>
         </w:tc>
@@ -1537,11 +1600,16 @@
             <w:r>
               <w:t xml:space="preserve">{%tr if </w:t>
             </w:r>
+            <w:proofErr w:type="spellStart"/>
             <w:r>
               <w:t>find</w:t>
             </w:r>
             <w:r>
-              <w:t xml:space="preserve">_who_ordered == 'unknown' </w:t>
+              <w:t>_who_ordered</w:t>
+            </w:r>
+            <w:proofErr w:type="spellEnd"/>
+            <w:r>
+              <w:t xml:space="preserve"> == 'unknown' </w:t>
             </w:r>
             <w:r>
               <w:t>%}</w:t>
@@ -1561,9 +1629,11 @@
             <w:pPr>
               <w:pStyle w:val="Body"/>
             </w:pPr>
+            <w:proofErr w:type="spellStart"/>
             <w:r>
               <w:t>find_out_step</w:t>
             </w:r>
+            <w:proofErr w:type="spellEnd"/>
             <w:r>
               <w:br/>
             </w:r>
@@ -1604,13 +1674,21 @@
               <w:t>{</w:t>
             </w:r>
             <w:r>
-              <w:t>{ find_out</w:t>
+              <w:t xml:space="preserve">{ </w:t>
+            </w:r>
+            <w:proofErr w:type="spellStart"/>
+            <w:r>
+              <w:t>find_out</w:t>
             </w:r>
             <w:r>
               <w:t>_step</w:t>
             </w:r>
             <w:r>
-              <w:t>.subject }</w:t>
+              <w:t>.subject</w:t>
+            </w:r>
+            <w:proofErr w:type="spellEnd"/>
+            <w:r>
+              <w:t xml:space="preserve"> }</w:t>
             </w:r>
             <w:r>
               <w:t>}</w:t>
@@ -2386,8 +2464,17 @@
                   <w:rStyle w:val="Hyperlink"/>
                   <w:spacing w:val="0"/>
                 </w:rPr>
-                <w:t>ak-courts.info/dir</w:t>
-              </w:r>
+                <w:t>ak-courts.info/</w:t>
+              </w:r>
+              <w:proofErr w:type="spellStart"/>
+              <w:r>
+                <w:rPr>
+                  <w:rStyle w:val="Hyperlink"/>
+                  <w:spacing w:val="0"/>
+                </w:rPr>
+                <w:t>dir</w:t>
+              </w:r>
+              <w:proofErr w:type="spellEnd"/>
             </w:hyperlink>
           </w:p>
           <w:p>
@@ -2416,8 +2503,17 @@
                   <w:rStyle w:val="Hyperlink"/>
                   <w:spacing w:val="0"/>
                 </w:rPr>
-                <w:t>ak-courts.info/courtview</w:t>
-              </w:r>
+                <w:t>ak-courts.info/</w:t>
+              </w:r>
+              <w:proofErr w:type="spellStart"/>
+              <w:r>
+                <w:rPr>
+                  <w:rStyle w:val="Hyperlink"/>
+                  <w:spacing w:val="0"/>
+                </w:rPr>
+                <w:t>courtview</w:t>
+              </w:r>
+              <w:proofErr w:type="spellEnd"/>
             </w:hyperlink>
           </w:p>
           <w:p>
@@ -2442,8 +2538,17 @@
                   <w:rStyle w:val="Hyperlink"/>
                   <w:spacing w:val="0"/>
                 </w:rPr>
-                <w:t>courtguide.akcourts.gov/start/ChangingEnforcingChildSupport</w:t>
-              </w:r>
+                <w:t>courtguide.akcourts.gov/start/</w:t>
+              </w:r>
+              <w:proofErr w:type="spellStart"/>
+              <w:r>
+                <w:rPr>
+                  <w:rStyle w:val="Hyperlink"/>
+                  <w:spacing w:val="0"/>
+                </w:rPr>
+                <w:t>ChangingEnforcingChildSupport</w:t>
+              </w:r>
+              <w:proofErr w:type="spellEnd"/>
             </w:hyperlink>
           </w:p>
           <w:p>
@@ -2536,8 +2641,17 @@
                   <w:rStyle w:val="Hyperlink"/>
                   <w:spacing w:val="0"/>
                 </w:rPr>
-                <w:t>ak-courts.info/mtm</w:t>
-              </w:r>
+                <w:t>ak-courts.info/</w:t>
+              </w:r>
+              <w:proofErr w:type="spellStart"/>
+              <w:r>
+                <w:rPr>
+                  <w:rStyle w:val="Hyperlink"/>
+                  <w:spacing w:val="0"/>
+                </w:rPr>
+                <w:t>mtm</w:t>
+              </w:r>
+              <w:proofErr w:type="spellEnd"/>
             </w:hyperlink>
           </w:p>
           <w:p>
@@ -2640,20 +2754,35 @@
             <w:r>
               <w:t>(</w:t>
             </w:r>
-            <w:r>
-              <w:t xml:space="preserve">who_ordered == </w:t>
+            <w:proofErr w:type="spellStart"/>
+            <w:r>
+              <w:t>who_ordered</w:t>
+            </w:r>
+            <w:proofErr w:type="spellEnd"/>
+            <w:r>
+              <w:t xml:space="preserve"> == </w:t>
             </w:r>
             <w:r>
               <w:t>'</w:t>
             </w:r>
+            <w:proofErr w:type="spellStart"/>
             <w:r>
               <w:t>cssd</w:t>
             </w:r>
+            <w:proofErr w:type="spellEnd"/>
             <w:r>
               <w:t>' or</w:t>
             </w:r>
             <w:r>
-              <w:t xml:space="preserve"> (who_ordered == </w:t>
+              <w:t xml:space="preserve"> (</w:t>
+            </w:r>
+            <w:proofErr w:type="spellStart"/>
+            <w:r>
+              <w:t>who_ordered</w:t>
+            </w:r>
+            <w:proofErr w:type="spellEnd"/>
+            <w:r>
+              <w:t xml:space="preserve"> == </w:t>
             </w:r>
             <w:r>
               <w:t>'</w:t>
@@ -2665,14 +2794,24 @@
               <w:t>'</w:t>
             </w:r>
             <w:r>
-              <w:t xml:space="preserve"> and find_who_ordered == </w:t>
+              <w:t xml:space="preserve"> and </w:t>
+            </w:r>
+            <w:proofErr w:type="spellStart"/>
+            <w:r>
+              <w:t>find_who_ordered</w:t>
+            </w:r>
+            <w:proofErr w:type="spellEnd"/>
+            <w:r>
+              <w:t xml:space="preserve"> == </w:t>
             </w:r>
             <w:r>
               <w:t>'</w:t>
             </w:r>
+            <w:proofErr w:type="spellStart"/>
             <w:r>
               <w:t>cssd</w:t>
             </w:r>
+            <w:proofErr w:type="spellEnd"/>
             <w:r>
               <w:t>'</w:t>
             </w:r>
@@ -2697,9 +2836,11 @@
             <w:pPr>
               <w:pStyle w:val="Body"/>
             </w:pPr>
+            <w:proofErr w:type="spellStart"/>
             <w:r>
               <w:t>ask_cssd_step</w:t>
             </w:r>
+            <w:proofErr w:type="spellEnd"/>
             <w:r>
               <w:br/>
             </w:r>
@@ -2730,11 +2871,16 @@
             <w:r>
               <w:t xml:space="preserve">{{ </w:t>
             </w:r>
+            <w:proofErr w:type="spellStart"/>
             <w:r>
               <w:t>ask_cssd_</w:t>
             </w:r>
             <w:r>
-              <w:t>step.subject }}</w:t>
+              <w:t>step.subject</w:t>
+            </w:r>
+            <w:proofErr w:type="spellEnd"/>
+            <w:r>
+              <w:t xml:space="preserve"> }}</w:t>
             </w:r>
           </w:p>
         </w:tc>
@@ -3227,14 +3373,22 @@
               <w:rPr>
                 <w:color w:val="FF0000"/>
               </w:rPr>
-              <w:t xml:space="preserve"> parents_agree</w:t>
-            </w:r>
+              <w:t xml:space="preserve"> </w:t>
+            </w:r>
+            <w:proofErr w:type="spellStart"/>
             <w:r>
               <w:rPr>
                 <w:color w:val="FF0000"/>
               </w:rPr>
+              <w:t>parents_agree</w:t>
+            </w:r>
+            <w:r>
+              <w:rPr>
+                <w:color w:val="FF0000"/>
+              </w:rPr>
               <w:t>_resources</w:t>
             </w:r>
+            <w:proofErr w:type="spellEnd"/>
             <w:r>
               <w:rPr>
                 <w:color w:val="FF0000"/>
@@ -3256,12 +3410,14 @@
             <w:pPr>
               <w:pStyle w:val="Body"/>
             </w:pPr>
+            <w:proofErr w:type="spellStart"/>
             <w:r>
               <w:t>tell_the_court</w:t>
             </w:r>
             <w:r>
               <w:t>_step</w:t>
             </w:r>
+            <w:proofErr w:type="spellEnd"/>
             <w:r>
               <w:t xml:space="preserve"> from </w:t>
             </w:r>
@@ -3296,13 +3452,21 @@
               <w:outlineLvl w:val="1"/>
             </w:pPr>
             <w:r>
-              <w:t>{{ tell_the_court</w:t>
+              <w:t xml:space="preserve">{{ </w:t>
+            </w:r>
+            <w:proofErr w:type="spellStart"/>
+            <w:r>
+              <w:t>tell_the_court</w:t>
             </w:r>
             <w:r>
               <w:t>_step</w:t>
             </w:r>
             <w:r>
-              <w:t>.subject }}</w:t>
+              <w:t>.subject</w:t>
+            </w:r>
+            <w:proofErr w:type="spellEnd"/>
+            <w:r>
+              <w:t xml:space="preserve"> }}</w:t>
             </w:r>
           </w:p>
         </w:tc>
@@ -3568,8 +3732,13 @@
             <w:r>
               <w:t xml:space="preserve">or </w:t>
             </w:r>
-            <w:r>
-              <w:t>unknown_interim_date in (</w:t>
+            <w:proofErr w:type="spellStart"/>
+            <w:r>
+              <w:t>unknown_interim_date</w:t>
+            </w:r>
+            <w:proofErr w:type="spellEnd"/>
+            <w:r>
+              <w:t xml:space="preserve"> in (</w:t>
             </w:r>
             <w:r>
               <w:t>'</w:t>
@@ -3661,14 +3830,21 @@
             <w:pPr>
               <w:pStyle w:val="Body"/>
             </w:pPr>
+            <w:proofErr w:type="spellStart"/>
             <w:r>
               <w:t>learn_reconsider_step</w:t>
             </w:r>
+            <w:proofErr w:type="spellEnd"/>
             <w:r>
               <w:t xml:space="preserve"> and </w:t>
             </w:r>
-            <w:r>
-              <w:t xml:space="preserve">fill_reconsider_step </w:t>
+            <w:proofErr w:type="spellStart"/>
+            <w:r>
+              <w:t>fill_reconsider_step</w:t>
+            </w:r>
+            <w:proofErr w:type="spellEnd"/>
+            <w:r>
+              <w:t xml:space="preserve"> </w:t>
             </w:r>
             <w:r>
               <w:t xml:space="preserve">from </w:t>
@@ -3704,7 +3880,15 @@
               <w:outlineLvl w:val="1"/>
             </w:pPr>
             <w:r>
-              <w:t>{{ learn_reconsider_step.subject }}</w:t>
+              <w:t xml:space="preserve">{{ </w:t>
+            </w:r>
+            <w:proofErr w:type="spellStart"/>
+            <w:r>
+              <w:t>learn_reconsider_step.subject</w:t>
+            </w:r>
+            <w:proofErr w:type="spellEnd"/>
+            <w:r>
+              <w:t xml:space="preserve"> }}</w:t>
             </w:r>
           </w:p>
         </w:tc>
@@ -3753,7 +3937,15 @@
             </w:pPr>
             <w:r>
               <w:lastRenderedPageBreak/>
-              <w:t>{{ fill_reconsider_step.subject }}</w:t>
+              <w:t xml:space="preserve">{{ </w:t>
+            </w:r>
+            <w:proofErr w:type="spellStart"/>
+            <w:r>
+              <w:t>fill_reconsider_step.subject</w:t>
+            </w:r>
+            <w:proofErr w:type="spellEnd"/>
+            <w:r>
+              <w:t xml:space="preserve"> }}</w:t>
             </w:r>
           </w:p>
         </w:tc>
@@ -3855,6 +4047,7 @@
               </w:rPr>
               <w:t xml:space="preserve">or </w:t>
             </w:r>
+            <w:proofErr w:type="spellStart"/>
             <w:r>
               <w:rPr>
                 <w:color w:val="00B0F0"/>
@@ -3873,6 +4066,7 @@
               </w:rPr>
               <w:t>_date</w:t>
             </w:r>
+            <w:proofErr w:type="spellEnd"/>
             <w:r>
               <w:rPr>
                 <w:color w:val="00B0F0"/>
@@ -3996,9 +4190,11 @@
             <w:pPr>
               <w:pStyle w:val="Body"/>
             </w:pPr>
+            <w:proofErr w:type="spellStart"/>
             <w:r>
               <w:t>modify_step</w:t>
             </w:r>
+            <w:proofErr w:type="spellEnd"/>
             <w:r>
               <w:t xml:space="preserve"> from </w:t>
             </w:r>
@@ -4016,9 +4212,11 @@
             <w:pPr>
               <w:pStyle w:val="Body"/>
             </w:pPr>
+            <w:proofErr w:type="spellStart"/>
             <w:r>
               <w:t>calculate_child_support_step</w:t>
             </w:r>
+            <w:proofErr w:type="spellEnd"/>
             <w:r>
               <w:t xml:space="preserve"> from </w:t>
             </w:r>
@@ -4036,9 +4234,11 @@
             <w:pPr>
               <w:pStyle w:val="Body"/>
             </w:pPr>
+            <w:proofErr w:type="spellStart"/>
             <w:r>
               <w:t>compare_child_support_step</w:t>
             </w:r>
+            <w:proofErr w:type="spellEnd"/>
             <w:r>
               <w:t xml:space="preserve"> </w:t>
             </w:r>
@@ -4059,9 +4259,11 @@
             <w:pPr>
               <w:pStyle w:val="Body"/>
             </w:pPr>
+            <w:proofErr w:type="spellStart"/>
             <w:r>
               <w:t>dont_wait_modify_child_support_step</w:t>
             </w:r>
+            <w:proofErr w:type="spellEnd"/>
             <w:r>
               <w:t xml:space="preserve"> from </w:t>
             </w:r>
@@ -4079,9 +4281,11 @@
             <w:pPr>
               <w:pStyle w:val="Body"/>
             </w:pPr>
+            <w:proofErr w:type="spellStart"/>
             <w:r>
               <w:t>fill_modify_step</w:t>
             </w:r>
+            <w:proofErr w:type="spellEnd"/>
             <w:r>
               <w:t xml:space="preserve"> from </w:t>
             </w:r>
@@ -4116,7 +4320,15 @@
               <w:outlineLvl w:val="1"/>
             </w:pPr>
             <w:r>
-              <w:t>{{ modify_step.subject }}</w:t>
+              <w:t xml:space="preserve">{{ </w:t>
+            </w:r>
+            <w:proofErr w:type="spellStart"/>
+            <w:r>
+              <w:t>modify_step.subject</w:t>
+            </w:r>
+            <w:proofErr w:type="spellEnd"/>
+            <w:r>
+              <w:t xml:space="preserve"> }}</w:t>
             </w:r>
           </w:p>
         </w:tc>
@@ -4164,7 +4376,15 @@
               <w:outlineLvl w:val="1"/>
             </w:pPr>
             <w:r>
-              <w:t>{{ calculate_child_support_step.subject }}</w:t>
+              <w:t xml:space="preserve">{{ </w:t>
+            </w:r>
+            <w:proofErr w:type="spellStart"/>
+            <w:r>
+              <w:t>calculate_child_support_step.subject</w:t>
+            </w:r>
+            <w:proofErr w:type="spellEnd"/>
+            <w:r>
+              <w:t xml:space="preserve"> }}</w:t>
             </w:r>
           </w:p>
         </w:tc>
@@ -4212,11 +4432,19 @@
               <w:outlineLvl w:val="1"/>
             </w:pPr>
             <w:r>
-              <w:t>{{ compare_child_support_step.</w:t>
+              <w:t xml:space="preserve">{{ </w:t>
+            </w:r>
+            <w:proofErr w:type="spellStart"/>
+            <w:r>
+              <w:t>compare_child_support_step.</w:t>
             </w:r>
             <w:r>
               <w:lastRenderedPageBreak/>
-              <w:t>subject }}</w:t>
+              <w:t>subject</w:t>
+            </w:r>
+            <w:proofErr w:type="spellEnd"/>
+            <w:r>
+              <w:t xml:space="preserve"> }}</w:t>
             </w:r>
           </w:p>
         </w:tc>
@@ -4371,7 +4599,15 @@
               <w:outlineLvl w:val="1"/>
             </w:pPr>
             <w:r>
-              <w:t>{{ fill_modify_step.subject }}</w:t>
+              <w:t xml:space="preserve">{{ </w:t>
+            </w:r>
+            <w:proofErr w:type="spellStart"/>
+            <w:r>
+              <w:t>fill_modify_step.subject</w:t>
+            </w:r>
+            <w:proofErr w:type="spellEnd"/>
+            <w:r>
+              <w:t xml:space="preserve"> }}</w:t>
             </w:r>
           </w:p>
         </w:tc>
@@ -4638,7 +4874,13 @@
               <w:pStyle w:val="Body"/>
             </w:pPr>
             <w:r>
-              <w:t>{{p (include_docx_template("docassemble.AKA2JBranding:fill_aside</w:t>
+              <w:t>{{p (include_docx_template("docassemble.AKA2JBranding:fill_</w:t>
+            </w:r>
+            <w:r>
+              <w:t>set_</w:t>
+            </w:r>
+            <w:r>
+              <w:t>aside</w:t>
             </w:r>
             <w:r>
               <w:t>_</w:t>
@@ -4752,9 +4994,11 @@
             <w:pPr>
               <w:pStyle w:val="Body"/>
             </w:pPr>
+            <w:proofErr w:type="spellStart"/>
             <w:r>
               <w:t>foreign_step</w:t>
             </w:r>
+            <w:proofErr w:type="spellEnd"/>
             <w:r>
               <w:br/>
               <w:t>2026-08-10</w:t>
@@ -4781,7 +5025,15 @@
               <w:outlineLvl w:val="1"/>
             </w:pPr>
             <w:r>
-              <w:t>{{ foreign_step.subject }}</w:t>
+              <w:t xml:space="preserve">{{ </w:t>
+            </w:r>
+            <w:proofErr w:type="spellStart"/>
+            <w:r>
+              <w:t>foreign_step.subject</w:t>
+            </w:r>
+            <w:proofErr w:type="spellEnd"/>
+            <w:r>
+              <w:t xml:space="preserve"> }}</w:t>
             </w:r>
           </w:p>
         </w:tc>
@@ -5057,7 +5309,15 @@
               </w:r>
             </w:hyperlink>
             <w:r>
-              <w:t>acf.hhs.gov/css/parents/find-local-child-support-office</w:t>
+              <w:t>acf.hhs.gov/</w:t>
+            </w:r>
+            <w:proofErr w:type="spellStart"/>
+            <w:r>
+              <w:t>css</w:t>
+            </w:r>
+            <w:proofErr w:type="spellEnd"/>
+            <w:r>
+              <w:t>/parents/find-local-child-support-office</w:t>
             </w:r>
           </w:p>
           <w:p>
@@ -5086,8 +5346,17 @@
                   <w:rStyle w:val="Hyperlink"/>
                   <w:spacing w:val="0"/>
                 </w:rPr>
-                <w:t>ak-courts.info/findlawyer</w:t>
-              </w:r>
+                <w:t>ak-courts.info/</w:t>
+              </w:r>
+              <w:proofErr w:type="spellStart"/>
+              <w:r>
+                <w:rPr>
+                  <w:rStyle w:val="Hyperlink"/>
+                  <w:spacing w:val="0"/>
+                </w:rPr>
+                <w:t>findlawyer</w:t>
+              </w:r>
+              <w:proofErr w:type="spellEnd"/>
             </w:hyperlink>
           </w:p>
         </w:tc>
@@ -5377,25 +5646,53 @@
               <w:rPr>
                 <w:color w:val="FFC000"/>
               </w:rPr>
-              <w:t>{% if who_</w:t>
-            </w:r>
+              <w:t xml:space="preserve">{% if </w:t>
+            </w:r>
+            <w:proofErr w:type="spellStart"/>
             <w:r>
               <w:rPr>
                 <w:color w:val="FFC000"/>
               </w:rPr>
+              <w:t>who_</w:t>
+            </w:r>
+            <w:r>
+              <w:rPr>
+                <w:color w:val="FFC000"/>
+              </w:rPr>
               <w:t>really_</w:t>
             </w:r>
             <w:r>
               <w:rPr>
                 <w:color w:val="FFC000"/>
               </w:rPr>
-              <w:t>ordered == 'court' %}</w:t>
+              <w:t>ordered</w:t>
+            </w:r>
+            <w:proofErr w:type="spellEnd"/>
+            <w:r>
+              <w:rPr>
+                <w:color w:val="FFC000"/>
+              </w:rPr>
+              <w:t xml:space="preserve"> == 'court' %}</w:t>
             </w:r>
             <w:r>
               <w:rPr>
                 <w:color w:val="92D050"/>
               </w:rPr>
-              <w:t>{% if cssd_collect == 'yes' %}</w:t>
+              <w:t xml:space="preserve">{% if </w:t>
+            </w:r>
+            <w:proofErr w:type="spellStart"/>
+            <w:r>
+              <w:rPr>
+                <w:color w:val="92D050"/>
+              </w:rPr>
+              <w:t>cssd_collect</w:t>
+            </w:r>
+            <w:proofErr w:type="spellEnd"/>
+            <w:r>
+              <w:rPr>
+                <w:color w:val="92D050"/>
+              </w:rPr>
+              <w:t xml:space="preserve"> == 'yes' %}</w:t>
             </w:r>
             <w:r>
               <w:t xml:space="preserve">If </w:t>
@@ -5422,7 +5719,21 @@
               <w:rPr>
                 <w:color w:val="92D050"/>
               </w:rPr>
-              <w:t xml:space="preserve">{% elif cssd_collect </w:t>
+              <w:t xml:space="preserve">{% elif </w:t>
+            </w:r>
+            <w:proofErr w:type="spellStart"/>
+            <w:r>
+              <w:rPr>
+                <w:color w:val="92D050"/>
+              </w:rPr>
+              <w:t>cssd_collect</w:t>
+            </w:r>
+            <w:proofErr w:type="spellEnd"/>
+            <w:r>
+              <w:rPr>
+                <w:color w:val="92D050"/>
+              </w:rPr>
+              <w:t xml:space="preserve"> </w:t>
             </w:r>
             <w:r>
               <w:rPr>
@@ -5874,7 +6185,23 @@
                   <w:rStyle w:val="Hyperlink"/>
                   <w:spacing w:val="0"/>
                 </w:rPr>
-                <w:t>acf.hhs.gov/css/parents/find-local-child-support-office</w:t>
+                <w:t>acf.hhs.gov/</w:t>
+              </w:r>
+              <w:proofErr w:type="spellStart"/>
+              <w:r>
+                <w:rPr>
+                  <w:rStyle w:val="Hyperlink"/>
+                  <w:spacing w:val="0"/>
+                </w:rPr>
+                <w:t>css</w:t>
+              </w:r>
+              <w:proofErr w:type="spellEnd"/>
+              <w:r>
+                <w:rPr>
+                  <w:rStyle w:val="Hyperlink"/>
+                  <w:spacing w:val="0"/>
+                </w:rPr>
+                <w:t>/parents/find-local-child-support-office</w:t>
               </w:r>
             </w:hyperlink>
           </w:p>
@@ -6042,7 +6369,15 @@
               <w:outlineLvl w:val="1"/>
             </w:pPr>
             <w:r>
-              <w:t>{{ register_order_step.subject }}</w:t>
+              <w:t xml:space="preserve">{{ </w:t>
+            </w:r>
+            <w:proofErr w:type="spellStart"/>
+            <w:r>
+              <w:t>register_order_step.subject</w:t>
+            </w:r>
+            <w:proofErr w:type="spellEnd"/>
+            <w:r>
+              <w:t xml:space="preserve"> }}</w:t>
             </w:r>
           </w:p>
         </w:tc>
@@ -6193,9 +6528,11 @@
             <w:pPr>
               <w:pStyle w:val="Body"/>
             </w:pPr>
+            <w:proofErr w:type="spellStart"/>
             <w:r>
               <w:t>talk_w_other_parent_step</w:t>
             </w:r>
+            <w:proofErr w:type="spellEnd"/>
             <w:r>
               <w:br/>
               <w:t>2026-08-10</w:t>
@@ -6224,11 +6561,16 @@
             <w:r>
               <w:t xml:space="preserve">{{ </w:t>
             </w:r>
+            <w:proofErr w:type="spellStart"/>
             <w:r>
               <w:t>talk_w_other_parent_step</w:t>
             </w:r>
             <w:r>
-              <w:t>.subject }}</w:t>
+              <w:t>.subject</w:t>
+            </w:r>
+            <w:proofErr w:type="spellEnd"/>
+            <w:r>
+              <w:t xml:space="preserve"> }}</w:t>
             </w:r>
           </w:p>
         </w:tc>
@@ -6287,7 +6629,15 @@
               <w:pStyle w:val="ListParagraph"/>
             </w:pPr>
             <w:r>
-              <w:t>Tell them if they do not do it you will ask the judge to enforce the order.</w:t>
+              <w:t xml:space="preserve">Tell them if they do not do </w:t>
+            </w:r>
+            <w:proofErr w:type="gramStart"/>
+            <w:r>
+              <w:t>it</w:t>
+            </w:r>
+            <w:proofErr w:type="gramEnd"/>
+            <w:r>
+              <w:t xml:space="preserve"> you will ask the judge to enforce the order.</w:t>
             </w:r>
           </w:p>
           <w:p>
@@ -6421,9 +6771,11 @@
             <w:pPr>
               <w:pStyle w:val="Body"/>
             </w:pPr>
+            <w:proofErr w:type="spellStart"/>
             <w:r>
               <w:t>court_to_enforce_step</w:t>
             </w:r>
+            <w:proofErr w:type="spellEnd"/>
             <w:r>
               <w:br/>
               <w:t>2026-08-10</w:t>
@@ -6453,6 +6805,7 @@
               <w:lastRenderedPageBreak/>
               <w:t xml:space="preserve">{{ </w:t>
             </w:r>
+            <w:proofErr w:type="spellStart"/>
             <w:r>
               <w:t>court_to_enforce</w:t>
             </w:r>
@@ -6460,7 +6813,11 @@
               <w:t>_step</w:t>
             </w:r>
             <w:r>
-              <w:t>.subject }}</w:t>
+              <w:t>.subject</w:t>
+            </w:r>
+            <w:proofErr w:type="spellEnd"/>
+            <w:r>
+              <w:t xml:space="preserve"> }}</w:t>
             </w:r>
           </w:p>
         </w:tc>
@@ -7733,7 +8090,49 @@
               <w:rPr>
                 <w:color w:val="FFC000"/>
               </w:rPr>
-              <w:t>interim_order_date_within_10_days or interim_order_date_more_than_10_days or unknown_interim_date in('reconsider', 'modify', ‘both’) or final_order_date_within_10_days or final_order_date_within_30_days or final_order_date_more_30_days or unknown_final_date.any_true('reconsider','set aside') or (</w:t>
+              <w:t xml:space="preserve">interim_order_date_within_10_days or interim_order_date_more_than_10_days or </w:t>
+            </w:r>
+            <w:proofErr w:type="spellStart"/>
+            <w:r>
+              <w:rPr>
+                <w:color w:val="FFC000"/>
+              </w:rPr>
+              <w:t>unknown_interim_date</w:t>
+            </w:r>
+            <w:proofErr w:type="spellEnd"/>
+            <w:r>
+              <w:rPr>
+                <w:color w:val="FFC000"/>
+              </w:rPr>
+              <w:t xml:space="preserve"> in('reconsider', 'modify', ‘both’) or final_order_date_within_10_days or final_order_date_within_30_days or final_order_date_more_30_days or </w:t>
+            </w:r>
+            <w:proofErr w:type="spellStart"/>
+            <w:r>
+              <w:rPr>
+                <w:color w:val="FFC000"/>
+              </w:rPr>
+              <w:t>unknown_final_date.any_true</w:t>
+            </w:r>
+            <w:proofErr w:type="spellEnd"/>
+            <w:r>
+              <w:rPr>
+                <w:color w:val="FFC000"/>
+              </w:rPr>
+              <w:t>('</w:t>
+            </w:r>
+            <w:proofErr w:type="spellStart"/>
+            <w:r>
+              <w:rPr>
+                <w:color w:val="FFC000"/>
+              </w:rPr>
+              <w:t>reconsider','set</w:t>
+            </w:r>
+            <w:proofErr w:type="spellEnd"/>
+            <w:r>
+              <w:rPr>
+                <w:color w:val="FFC000"/>
+              </w:rPr>
+              <w:t xml:space="preserve"> aside') or (</w:t>
             </w:r>
             <w:r>
               <w:rPr>
@@ -7911,7 +8310,49 @@
               <w:rPr>
                 <w:color w:val="FF0000"/>
               </w:rPr>
-              <w:t>{%tr if interim_order_date_within_10_days or interim_order_date_more_than_10_days or unknown_interim_date in('reconsider', 'modify', ‘both’) or final_order_date_within_10_days or final_order_date_within_30_days or final_order_date_more_30_days or unknown_final_date.any_true('reconsider','set aside') or (</w:t>
+              <w:t xml:space="preserve">{%tr if interim_order_date_within_10_days or interim_order_date_more_than_10_days or </w:t>
+            </w:r>
+            <w:proofErr w:type="spellStart"/>
+            <w:r>
+              <w:rPr>
+                <w:color w:val="FF0000"/>
+              </w:rPr>
+              <w:t>unknown_interim_date</w:t>
+            </w:r>
+            <w:proofErr w:type="spellEnd"/>
+            <w:r>
+              <w:rPr>
+                <w:color w:val="FF0000"/>
+              </w:rPr>
+              <w:t xml:space="preserve"> in('reconsider', 'modify', ‘both’) or final_order_date_within_10_days or final_order_date_within_30_days or final_order_date_more_30_days or </w:t>
+            </w:r>
+            <w:proofErr w:type="spellStart"/>
+            <w:r>
+              <w:rPr>
+                <w:color w:val="FF0000"/>
+              </w:rPr>
+              <w:t>unknown_final_date.any_true</w:t>
+            </w:r>
+            <w:proofErr w:type="spellEnd"/>
+            <w:r>
+              <w:rPr>
+                <w:color w:val="FF0000"/>
+              </w:rPr>
+              <w:t>('</w:t>
+            </w:r>
+            <w:proofErr w:type="spellStart"/>
+            <w:r>
+              <w:rPr>
+                <w:color w:val="FF0000"/>
+              </w:rPr>
+              <w:t>reconsider','set</w:t>
+            </w:r>
+            <w:proofErr w:type="spellEnd"/>
+            <w:r>
+              <w:rPr>
+                <w:color w:val="FF0000"/>
+              </w:rPr>
+              <w:t xml:space="preserve"> aside') or (</w:t>
             </w:r>
             <w:r>
               <w:rPr>
@@ -8131,8 +8572,13 @@
             <w:r>
               <w:br/>
             </w:r>
-            <w:r>
-              <w:t>unknown_interim_date == 'modify'</w:t>
+            <w:proofErr w:type="spellStart"/>
+            <w:r>
+              <w:t>unknown_interim_date</w:t>
+            </w:r>
+            <w:proofErr w:type="spellEnd"/>
+            <w:r>
+              <w:t xml:space="preserve"> == 'modify'</w:t>
             </w:r>
             <w:r>
               <w:rPr>
@@ -8161,8 +8607,13 @@
             <w:r>
               <w:br/>
             </w:r>
-            <w:r>
-              <w:t>unknown_interim_date == '</w:t>
+            <w:proofErr w:type="spellStart"/>
+            <w:r>
+              <w:t>unknown_interim_date</w:t>
+            </w:r>
+            <w:proofErr w:type="spellEnd"/>
+            <w:r>
+              <w:t xml:space="preserve"> == '</w:t>
             </w:r>
             <w:r>
               <w:t>both</w:t>
@@ -8333,9 +8784,11 @@
             <w:pPr>
               <w:pStyle w:val="Body"/>
             </w:pPr>
+            <w:proofErr w:type="spellStart"/>
             <w:r>
               <w:t>expect_after_motion_step</w:t>
             </w:r>
+            <w:proofErr w:type="spellEnd"/>
             <w:r>
               <w:t xml:space="preserve"> from </w:t>
             </w:r>
@@ -8374,7 +8827,21 @@
                 <w:rFonts w:eastAsia="Calibri"/>
               </w:rPr>
               <w:lastRenderedPageBreak/>
-              <w:t>{{ expect_after_motion_or_answer_step.subject }}</w:t>
+              <w:t xml:space="preserve">{{ </w:t>
+            </w:r>
+            <w:proofErr w:type="spellStart"/>
+            <w:r>
+              <w:rPr>
+                <w:rFonts w:eastAsia="Calibri"/>
+              </w:rPr>
+              <w:t>expect_after_motion_or_answer_step.subject</w:t>
+            </w:r>
+            <w:proofErr w:type="spellEnd"/>
+            <w:r>
+              <w:rPr>
+                <w:rFonts w:eastAsia="Calibri"/>
+              </w:rPr>
+              <w:t xml:space="preserve"> }}</w:t>
             </w:r>
           </w:p>
         </w:tc>
@@ -8468,7 +8935,15 @@
               <w:t>or</w:t>
             </w:r>
             <w:r>
-              <w:t xml:space="preserve"> unknown_interim_date in(</w:t>
+              <w:t xml:space="preserve"> </w:t>
+            </w:r>
+            <w:proofErr w:type="spellStart"/>
+            <w:r>
+              <w:t>unknown_interim_date</w:t>
+            </w:r>
+            <w:proofErr w:type="spellEnd"/>
+            <w:r>
+              <w:t xml:space="preserve"> in(</w:t>
             </w:r>
             <w:r>
               <w:t>'</w:t>
@@ -8542,9 +9017,11 @@
             <w:pPr>
               <w:pStyle w:val="Body"/>
             </w:pPr>
+            <w:proofErr w:type="spellStart"/>
             <w:r>
               <w:t>expect_reconsider_step</w:t>
             </w:r>
+            <w:proofErr w:type="spellEnd"/>
             <w:r>
               <w:t xml:space="preserve"> from </w:t>
             </w:r>
@@ -8579,7 +9056,15 @@
               <w:outlineLvl w:val="1"/>
             </w:pPr>
             <w:r>
-              <w:t>{{ expect_reconsider_step.subject }}</w:t>
+              <w:t xml:space="preserve">{{ </w:t>
+            </w:r>
+            <w:proofErr w:type="spellStart"/>
+            <w:r>
+              <w:t>expect_reconsider_step.subject</w:t>
+            </w:r>
+            <w:proofErr w:type="spellEnd"/>
+            <w:r>
+              <w:t xml:space="preserve"> }}</w:t>
             </w:r>
           </w:p>
         </w:tc>
@@ -8646,9 +9131,11 @@
             <w:pPr>
               <w:pStyle w:val="Body"/>
             </w:pPr>
+            <w:proofErr w:type="spellStart"/>
             <w:r>
               <w:t>get_help</w:t>
             </w:r>
+            <w:proofErr w:type="spellEnd"/>
             <w:r>
               <w:t xml:space="preserve"> from </w:t>
             </w:r>
@@ -8684,7 +9171,15 @@
             </w:pPr>
             <w:bookmarkStart w:id="4" w:name="_Hlk136618706"/>
             <w:r>
-              <w:t>{{ get_help.subject }}</w:t>
+              <w:t xml:space="preserve">{{ </w:t>
+            </w:r>
+            <w:proofErr w:type="spellStart"/>
+            <w:r>
+              <w:t>get_help.subject</w:t>
+            </w:r>
+            <w:proofErr w:type="spellEnd"/>
+            <w:r>
+              <w:t xml:space="preserve"> }}</w:t>
             </w:r>
             <w:bookmarkEnd w:id="3"/>
           </w:p>
@@ -8803,27 +9298,14 @@
     <w:r>
       <w:t xml:space="preserve"> of </w:t>
     </w:r>
-    <w:r>
-      <w:fldChar w:fldCharType="begin"/>
-    </w:r>
-    <w:r>
-      <w:instrText xml:space="preserve"> NUMPAGES  \* Arabic  \* MERGEFORMAT </w:instrText>
-    </w:r>
-    <w:r>
-      <w:fldChar w:fldCharType="separate"/>
-    </w:r>
-    <w:r>
-      <w:rPr>
-        <w:noProof/>
-      </w:rPr>
-      <w:t>39</w:t>
-    </w:r>
-    <w:r>
-      <w:rPr>
-        <w:noProof/>
-      </w:rPr>
-      <w:fldChar w:fldCharType="end"/>
-    </w:r>
+    <w:fldSimple w:instr=" NUMPAGES  \* Arabic  \* MERGEFORMAT ">
+      <w:r>
+        <w:rPr>
+          <w:noProof/>
+        </w:rPr>
+        <w:t>39</w:t>
+      </w:r>
+    </w:fldSimple>
     <w:r>
       <w:t xml:space="preserve"> pages</w:t>
     </w:r>
@@ -8838,7 +9320,7 @@
       <w:t>August 1</w:t>
     </w:r>
     <w:r>
-      <w:t>2</w:t>
+      <w:t>3</w:t>
     </w:r>
     <w:r>
       <w:t>, 202</w:t>

</xml_diff>

<commit_message>
Forgot to upload updated accordion_steps from 2026-08-19 - changed learn_child_support_modify to modify_step
</commit_message>
<xml_diff>
--- a/docassemble/ChangingOrEnforcingYourChildSupportOrder/data/templates/changing_child_support_action_plan.docx
+++ b/docassemble/ChangingOrEnforcingYourChildSupportOrder/data/templates/changing_child_support_action_plan.docx
@@ -2503,17 +2503,8 @@
                   <w:rStyle w:val="Hyperlink"/>
                   <w:spacing w:val="0"/>
                 </w:rPr>
-                <w:t>ak-courts.info/</w:t>
-              </w:r>
-              <w:proofErr w:type="spellStart"/>
-              <w:r>
-                <w:rPr>
-                  <w:rStyle w:val="Hyperlink"/>
-                  <w:spacing w:val="0"/>
-                </w:rPr>
-                <w:t>courtview</w:t>
-              </w:r>
-              <w:proofErr w:type="spellEnd"/>
+                <w:t>ak-courts.info/courtview</w:t>
+              </w:r>
             </w:hyperlink>
           </w:p>
           <w:p>
@@ -4324,7 +4315,10 @@
             </w:r>
             <w:proofErr w:type="spellStart"/>
             <w:r>
-              <w:t>modify_step.subject</w:t>
+              <w:t>modify</w:t>
+            </w:r>
+            <w:r>
+              <w:t>_step.subject</w:t>
             </w:r>
             <w:proofErr w:type="spellEnd"/>
             <w:r>
@@ -9317,10 +9311,10 @@
       <w:ind w:left="-450"/>
     </w:pPr>
     <w:r>
-      <w:t>August 1</w:t>
+      <w:t xml:space="preserve">August </w:t>
     </w:r>
     <w:r>
-      <w:t>3</w:t>
+      <w:t>20</w:t>
     </w:r>
     <w:r>
       <w:t>, 202</w:t>
@@ -13871,6 +13865,11 @@
       <w:szCs w:val="24"/>
     </w:rPr>
   </w:style>
+  <w:style w:type="character" w:customStyle="1" w:styleId="subject">
+    <w:name w:val="subject"/>
+    <w:basedOn w:val="DefaultParagraphFont"/>
+    <w:rsid w:val="00C46F2D"/>
+  </w:style>
 </w:styles>
 </file>
 

</xml_diff>